<commit_message>
Add worst-case-hardening Tier B: clears FlexDATE worst-case on all 4 topos (<500ms); report Section 8b, scripts, CSVs, refreshed reproduction zip + handoff
</commit_message>
<xml_diff>
--- a/results/gnn_lpd_dqn_selective_db_lp/condition_compliant_k10_k50/FINAL_REPORT/Topology_Agnostic_Bottleneck_Ranking_DDQN_Phase1_5_Final_Report.docx
+++ b/results/gnn_lpd_dqn_selective_db_lp/condition_compliant_k10_k50/FINAL_REPORT/Topology_Agnostic_Bottleneck_Ranking_DDQN_Phase1_5_Final_Report.docx
@@ -9117,6 +9117,821 @@
           <w:sz w:val="21"/>
         </w:rPr>
         <w:t>B. Separate high-accuracy Sprintlink deployable route (diagnostic, not the learned DDQN claim): bottleneck-aware deployable route, search/actuator verified — K800, k_paths=8: PR 0.9993, DB 0.0006, mean 379.5 ms, p95 439.4 ms; K1200, k_paths=4: PR 1.0000, DB 0.0005, mean 314.7 ms, p95 363.1 ms. This proves that the Sprintlink 0.999 target is reachable under 500 ms with the deployable bottleneck-ranking route, but it is not claimed as the learned DDQN output because the learned DDQN reached 0.9960.</w:t>
+      </w:r>
+    </w:p>
+    <w:p>
+      <w:r>
+        <w:br w:type="page"/>
+      </w:r>
+    </w:p>
+    <w:p>
+      <w:pPr>
+        <w:pStyle w:val="Heading1"/>
+      </w:pPr>
+      <w:r>
+        <w:t>8b. Worst-Case Hardening (Tier B Operating Point)</w:t>
+      </w:r>
+    </w:p>
+    <w:p>
+      <w:pPr>
+        <w:spacing w:after="120"/>
+      </w:pPr>
+      <w:r>
+        <w:rPr>
+          <w:b w:val="0"/>
+          <w:i w:val="0"/>
+          <w:sz w:val="21"/>
+        </w:rPr>
+        <w:t>FlexDATE reports per-topology worst-case PR. The runtime-efficient learned controller (Tier A, the frozen result in Section 7) leans on KEEP and small-K actions to keep average decision time low, which leaves a few individual hard or cold-start cycles with a low worst-case PR (e.g., GEANT first cycle 0.5848, Abilene 0.8109). We therefore define a second operating point, Tier B, that hardens the worst case using three GLOBAL deployment rules layered on the SAME argmax-Q DDQN (the network still selects the base action; the rules override it):</w:t>
+      </w:r>
+    </w:p>
+    <w:p>
+      <w:pPr>
+        <w:spacing w:after="120"/>
+      </w:pPr>
+      <w:r>
+        <w:rPr>
+          <w:b w:val="0"/>
+          <w:i/>
+          <w:sz w:val="21"/>
+        </w:rPr>
+        <w:t>(1) first-cycle full optimization (db_budget = 1.0) to remove the cold-start dip; (2) never KEEP -&gt; always optimize, removing stale-routing dips; (3) a minimum-optimize-budget K-floor plus a larger per-cycle DB budget (0.15) so hard cycles have room to reroute.</w:t>
+      </w:r>
+    </w:p>
+    <w:p>
+      <w:pPr>
+        <w:spacing w:after="120"/>
+      </w:pPr>
+      <w:r>
+        <w:rPr>
+          <w:b w:val="0"/>
+          <w:i w:val="0"/>
+          <w:sz w:val="21"/>
+        </w:rPr>
+        <w:t>With Tier B, all four FlexDATE topologies clear FlexDATE's reported worst-case PR, while remaining under the 500 ms decision-time budget (mean and p95) and far below the FlexDATE DB targets:</w:t>
+      </w:r>
+    </w:p>
+    <w:tbl>
+      <w:tblPr>
+        <w:tblStyle w:val="TableGrid"/>
+        <w:tblW w:type="auto" w:w="0"/>
+        <w:jc w:val="center"/>
+        <w:tblLook w:firstColumn="1" w:firstRow="1" w:lastColumn="0" w:lastRow="0" w:noHBand="0" w:noVBand="1" w:val="04A0"/>
+      </w:tblPr>
+      <w:tblGrid>
+        <w:gridCol w:w="965"/>
+        <w:gridCol w:w="965"/>
+        <w:gridCol w:w="965"/>
+        <w:gridCol w:w="965"/>
+        <w:gridCol w:w="965"/>
+        <w:gridCol w:w="965"/>
+        <w:gridCol w:w="965"/>
+        <w:gridCol w:w="965"/>
+        <w:gridCol w:w="965"/>
+        <w:gridCol w:w="965"/>
+      </w:tblGrid>
+      <w:tr>
+        <w:tc>
+          <w:tcPr>
+            <w:tcW w:type="dxa" w:w="965"/>
+            <w:shd w:val="clear" w:fill="1F4D78"/>
+          </w:tcPr>
+          <w:p>
+            <w:r>
+              <w:rPr>
+                <w:b/>
+                <w:color w:val="FFFFFF"/>
+                <w:sz w:val="16"/>
+              </w:rPr>
+              <w:t>Topology</w:t>
+            </w:r>
+          </w:p>
+        </w:tc>
+        <w:tc>
+          <w:tcPr>
+            <w:tcW w:type="dxa" w:w="965"/>
+            <w:shd w:val="clear" w:fill="1F4D78"/>
+          </w:tcPr>
+          <w:p>
+            <w:r>
+              <w:rPr>
+                <w:b/>
+                <w:color w:val="FFFFFF"/>
+                <w:sz w:val="16"/>
+              </w:rPr>
+              <w:t>FlexDATE worst</w:t>
+            </w:r>
+          </w:p>
+        </w:tc>
+        <w:tc>
+          <w:tcPr>
+            <w:tcW w:type="dxa" w:w="965"/>
+            <w:shd w:val="clear" w:fill="1F4D78"/>
+          </w:tcPr>
+          <w:p>
+            <w:r>
+              <w:rPr>
+                <w:b/>
+                <w:color w:val="FFFFFF"/>
+                <w:sz w:val="16"/>
+              </w:rPr>
+              <w:t>Tier A (frozen) Min PR</w:t>
+            </w:r>
+          </w:p>
+        </w:tc>
+        <w:tc>
+          <w:tcPr>
+            <w:tcW w:type="dxa" w:w="965"/>
+            <w:shd w:val="clear" w:fill="1F4D78"/>
+          </w:tcPr>
+          <w:p>
+            <w:r>
+              <w:rPr>
+                <w:b/>
+                <w:color w:val="FFFFFF"/>
+                <w:sz w:val="16"/>
+              </w:rPr>
+              <w:t>Tier B Min PR</w:t>
+            </w:r>
+          </w:p>
+        </w:tc>
+        <w:tc>
+          <w:tcPr>
+            <w:tcW w:type="dxa" w:w="965"/>
+            <w:shd w:val="clear" w:fill="1F4D78"/>
+          </w:tcPr>
+          <w:p>
+            <w:r>
+              <w:rPr>
+                <w:b/>
+                <w:color w:val="FFFFFF"/>
+                <w:sz w:val="16"/>
+              </w:rPr>
+              <w:t>Cleared</w:t>
+            </w:r>
+          </w:p>
+        </w:tc>
+        <w:tc>
+          <w:tcPr>
+            <w:tcW w:type="dxa" w:w="965"/>
+            <w:shd w:val="clear" w:fill="1F4D78"/>
+          </w:tcPr>
+          <w:p>
+            <w:r>
+              <w:rPr>
+                <w:b/>
+                <w:color w:val="FFFFFF"/>
+                <w:sz w:val="16"/>
+              </w:rPr>
+              <w:t>Tier B mean PR</w:t>
+            </w:r>
+          </w:p>
+        </w:tc>
+        <w:tc>
+          <w:tcPr>
+            <w:tcW w:type="dxa" w:w="965"/>
+            <w:shd w:val="clear" w:fill="1F4D78"/>
+          </w:tcPr>
+          <w:p>
+            <w:r>
+              <w:rPr>
+                <w:b/>
+                <w:color w:val="FFFFFF"/>
+                <w:sz w:val="16"/>
+              </w:rPr>
+              <w:t>mean ms</w:t>
+            </w:r>
+          </w:p>
+        </w:tc>
+        <w:tc>
+          <w:tcPr>
+            <w:tcW w:type="dxa" w:w="965"/>
+            <w:shd w:val="clear" w:fill="1F4D78"/>
+          </w:tcPr>
+          <w:p>
+            <w:r>
+              <w:rPr>
+                <w:b/>
+                <w:color w:val="FFFFFF"/>
+                <w:sz w:val="16"/>
+              </w:rPr>
+              <w:t>p95 ms</w:t>
+            </w:r>
+          </w:p>
+        </w:tc>
+        <w:tc>
+          <w:tcPr>
+            <w:tcW w:type="dxa" w:w="965"/>
+            <w:shd w:val="clear" w:fill="1F4D78"/>
+          </w:tcPr>
+          <w:p>
+            <w:r>
+              <w:rPr>
+                <w:b/>
+                <w:color w:val="FFFFFF"/>
+                <w:sz w:val="16"/>
+              </w:rPr>
+              <w:t>mean DB</w:t>
+            </w:r>
+          </w:p>
+        </w:tc>
+        <w:tc>
+          <w:tcPr>
+            <w:tcW w:type="dxa" w:w="965"/>
+            <w:shd w:val="clear" w:fill="1F4D78"/>
+          </w:tcPr>
+          <w:p>
+            <w:r>
+              <w:rPr>
+                <w:b/>
+                <w:color w:val="FFFFFF"/>
+                <w:sz w:val="16"/>
+              </w:rPr>
+              <w:t>K-floor</w:t>
+            </w:r>
+          </w:p>
+        </w:tc>
+      </w:tr>
+      <w:tr>
+        <w:tc>
+          <w:tcPr>
+            <w:tcW w:type="dxa" w:w="965"/>
+          </w:tcPr>
+          <w:p>
+            <w:r>
+              <w:rPr>
+                <w:b w:val="0"/>
+                <w:sz w:val="16"/>
+              </w:rPr>
+              <w:t>Abilene</w:t>
+            </w:r>
+          </w:p>
+        </w:tc>
+        <w:tc>
+          <w:tcPr>
+            <w:tcW w:type="dxa" w:w="965"/>
+          </w:tcPr>
+          <w:p>
+            <w:r>
+              <w:rPr>
+                <w:b w:val="0"/>
+                <w:sz w:val="16"/>
+              </w:rPr>
+              <w:t>0.870</w:t>
+            </w:r>
+          </w:p>
+        </w:tc>
+        <w:tc>
+          <w:tcPr>
+            <w:tcW w:type="dxa" w:w="965"/>
+          </w:tcPr>
+          <w:p>
+            <w:r>
+              <w:rPr>
+                <w:b w:val="0"/>
+                <w:sz w:val="16"/>
+              </w:rPr>
+              <w:t>0.8109</w:t>
+            </w:r>
+          </w:p>
+        </w:tc>
+        <w:tc>
+          <w:tcPr>
+            <w:tcW w:type="dxa" w:w="965"/>
+          </w:tcPr>
+          <w:p>
+            <w:r>
+              <w:rPr>
+                <w:b w:val="0"/>
+                <w:sz w:val="16"/>
+              </w:rPr>
+              <w:t>0.9656</w:t>
+            </w:r>
+          </w:p>
+        </w:tc>
+        <w:tc>
+          <w:tcPr>
+            <w:tcW w:type="dxa" w:w="965"/>
+          </w:tcPr>
+          <w:p>
+            <w:r>
+              <w:rPr>
+                <w:b w:val="0"/>
+                <w:sz w:val="16"/>
+              </w:rPr>
+              <w:t>yes</w:t>
+            </w:r>
+          </w:p>
+        </w:tc>
+        <w:tc>
+          <w:tcPr>
+            <w:tcW w:type="dxa" w:w="965"/>
+          </w:tcPr>
+          <w:p>
+            <w:r>
+              <w:rPr>
+                <w:b w:val="0"/>
+                <w:sz w:val="16"/>
+              </w:rPr>
+              <w:t>1.0000</w:t>
+            </w:r>
+          </w:p>
+        </w:tc>
+        <w:tc>
+          <w:tcPr>
+            <w:tcW w:type="dxa" w:w="965"/>
+          </w:tcPr>
+          <w:p>
+            <w:r>
+              <w:rPr>
+                <w:b w:val="0"/>
+                <w:sz w:val="16"/>
+              </w:rPr>
+              <w:t>23.0</w:t>
+            </w:r>
+          </w:p>
+        </w:tc>
+        <w:tc>
+          <w:tcPr>
+            <w:tcW w:type="dxa" w:w="965"/>
+          </w:tcPr>
+          <w:p>
+            <w:r>
+              <w:rPr>
+                <w:b w:val="0"/>
+                <w:sz w:val="16"/>
+              </w:rPr>
+              <w:t>24.7</w:t>
+            </w:r>
+          </w:p>
+        </w:tc>
+        <w:tc>
+          <w:tcPr>
+            <w:tcW w:type="dxa" w:w="965"/>
+          </w:tcPr>
+          <w:p>
+            <w:r>
+              <w:rPr>
+                <w:b w:val="0"/>
+                <w:sz w:val="16"/>
+              </w:rPr>
+              <w:t>0.0070</w:t>
+            </w:r>
+          </w:p>
+        </w:tc>
+        <w:tc>
+          <w:tcPr>
+            <w:tcW w:type="dxa" w:w="965"/>
+          </w:tcPr>
+          <w:p>
+            <w:r>
+              <w:rPr>
+                <w:b w:val="0"/>
+                <w:sz w:val="16"/>
+              </w:rPr>
+              <w:t>K300</w:t>
+            </w:r>
+          </w:p>
+        </w:tc>
+      </w:tr>
+      <w:tr>
+        <w:tc>
+          <w:tcPr>
+            <w:tcW w:type="dxa" w:w="965"/>
+          </w:tcPr>
+          <w:p>
+            <w:r>
+              <w:rPr>
+                <w:b w:val="0"/>
+                <w:sz w:val="16"/>
+              </w:rPr>
+              <w:t>GEANT</w:t>
+            </w:r>
+          </w:p>
+        </w:tc>
+        <w:tc>
+          <w:tcPr>
+            <w:tcW w:type="dxa" w:w="965"/>
+          </w:tcPr>
+          <w:p>
+            <w:r>
+              <w:rPr>
+                <w:b w:val="0"/>
+                <w:sz w:val="16"/>
+              </w:rPr>
+              <w:t>0.870</w:t>
+            </w:r>
+          </w:p>
+        </w:tc>
+        <w:tc>
+          <w:tcPr>
+            <w:tcW w:type="dxa" w:w="965"/>
+          </w:tcPr>
+          <w:p>
+            <w:r>
+              <w:rPr>
+                <w:b w:val="0"/>
+                <w:sz w:val="16"/>
+              </w:rPr>
+              <w:t>0.5848</w:t>
+            </w:r>
+          </w:p>
+        </w:tc>
+        <w:tc>
+          <w:tcPr>
+            <w:tcW w:type="dxa" w:w="965"/>
+          </w:tcPr>
+          <w:p>
+            <w:r>
+              <w:rPr>
+                <w:b w:val="0"/>
+                <w:sz w:val="16"/>
+              </w:rPr>
+              <w:t>0.9998</w:t>
+            </w:r>
+          </w:p>
+        </w:tc>
+        <w:tc>
+          <w:tcPr>
+            <w:tcW w:type="dxa" w:w="965"/>
+          </w:tcPr>
+          <w:p>
+            <w:r>
+              <w:rPr>
+                <w:b w:val="0"/>
+                <w:sz w:val="16"/>
+              </w:rPr>
+              <w:t>yes</w:t>
+            </w:r>
+          </w:p>
+        </w:tc>
+        <w:tc>
+          <w:tcPr>
+            <w:tcW w:type="dxa" w:w="965"/>
+          </w:tcPr>
+          <w:p>
+            <w:r>
+              <w:rPr>
+                <w:b w:val="0"/>
+                <w:sz w:val="16"/>
+              </w:rPr>
+              <w:t>1.0000</w:t>
+            </w:r>
+          </w:p>
+        </w:tc>
+        <w:tc>
+          <w:tcPr>
+            <w:tcW w:type="dxa" w:w="965"/>
+          </w:tcPr>
+          <w:p>
+            <w:r>
+              <w:rPr>
+                <w:b w:val="0"/>
+                <w:sz w:val="16"/>
+              </w:rPr>
+              <w:t>93.9</w:t>
+            </w:r>
+          </w:p>
+        </w:tc>
+        <w:tc>
+          <w:tcPr>
+            <w:tcW w:type="dxa" w:w="965"/>
+          </w:tcPr>
+          <w:p>
+            <w:r>
+              <w:rPr>
+                <w:b w:val="0"/>
+                <w:sz w:val="16"/>
+              </w:rPr>
+              <w:t>145.6</w:t>
+            </w:r>
+          </w:p>
+        </w:tc>
+        <w:tc>
+          <w:tcPr>
+            <w:tcW w:type="dxa" w:w="965"/>
+          </w:tcPr>
+          <w:p>
+            <w:r>
+              <w:rPr>
+                <w:b w:val="0"/>
+                <w:sz w:val="16"/>
+              </w:rPr>
+              <w:t>0.0024</w:t>
+            </w:r>
+          </w:p>
+        </w:tc>
+        <w:tc>
+          <w:tcPr>
+            <w:tcW w:type="dxa" w:w="965"/>
+          </w:tcPr>
+          <w:p>
+            <w:r>
+              <w:rPr>
+                <w:b w:val="0"/>
+                <w:sz w:val="16"/>
+              </w:rPr>
+              <w:t>K300</w:t>
+            </w:r>
+          </w:p>
+        </w:tc>
+      </w:tr>
+      <w:tr>
+        <w:tc>
+          <w:tcPr>
+            <w:tcW w:type="dxa" w:w="965"/>
+          </w:tcPr>
+          <w:p>
+            <w:r>
+              <w:rPr>
+                <w:b w:val="0"/>
+                <w:sz w:val="16"/>
+              </w:rPr>
+              <w:t>Sprintlink</w:t>
+            </w:r>
+          </w:p>
+        </w:tc>
+        <w:tc>
+          <w:tcPr>
+            <w:tcW w:type="dxa" w:w="965"/>
+          </w:tcPr>
+          <w:p>
+            <w:r>
+              <w:rPr>
+                <w:b w:val="0"/>
+                <w:sz w:val="16"/>
+              </w:rPr>
+              <w:t>0.976</w:t>
+            </w:r>
+          </w:p>
+        </w:tc>
+        <w:tc>
+          <w:tcPr>
+            <w:tcW w:type="dxa" w:w="965"/>
+          </w:tcPr>
+          <w:p>
+            <w:r>
+              <w:rPr>
+                <w:b w:val="0"/>
+                <w:sz w:val="16"/>
+              </w:rPr>
+              <w:t>0.9600</w:t>
+            </w:r>
+          </w:p>
+        </w:tc>
+        <w:tc>
+          <w:tcPr>
+            <w:tcW w:type="dxa" w:w="965"/>
+          </w:tcPr>
+          <w:p>
+            <w:r>
+              <w:rPr>
+                <w:b w:val="0"/>
+                <w:sz w:val="16"/>
+              </w:rPr>
+              <w:t>0.9768</w:t>
+            </w:r>
+          </w:p>
+        </w:tc>
+        <w:tc>
+          <w:tcPr>
+            <w:tcW w:type="dxa" w:w="965"/>
+          </w:tcPr>
+          <w:p>
+            <w:r>
+              <w:rPr>
+                <w:b w:val="0"/>
+                <w:sz w:val="16"/>
+              </w:rPr>
+              <w:t>yes</w:t>
+            </w:r>
+          </w:p>
+        </w:tc>
+        <w:tc>
+          <w:tcPr>
+            <w:tcW w:type="dxa" w:w="965"/>
+          </w:tcPr>
+          <w:p>
+            <w:r>
+              <w:rPr>
+                <w:b w:val="0"/>
+                <w:sz w:val="16"/>
+              </w:rPr>
+              <w:t>0.9965</w:t>
+            </w:r>
+          </w:p>
+        </w:tc>
+        <w:tc>
+          <w:tcPr>
+            <w:tcW w:type="dxa" w:w="965"/>
+          </w:tcPr>
+          <w:p>
+            <w:r>
+              <w:rPr>
+                <w:b w:val="0"/>
+                <w:sz w:val="16"/>
+              </w:rPr>
+              <w:t>206.0</w:t>
+            </w:r>
+          </w:p>
+        </w:tc>
+        <w:tc>
+          <w:tcPr>
+            <w:tcW w:type="dxa" w:w="965"/>
+          </w:tcPr>
+          <w:p>
+            <w:r>
+              <w:rPr>
+                <w:b w:val="0"/>
+                <w:sz w:val="16"/>
+              </w:rPr>
+              <w:t>271.7</w:t>
+            </w:r>
+          </w:p>
+        </w:tc>
+        <w:tc>
+          <w:tcPr>
+            <w:tcW w:type="dxa" w:w="965"/>
+          </w:tcPr>
+          <w:p>
+            <w:r>
+              <w:rPr>
+                <w:b w:val="0"/>
+                <w:sz w:val="16"/>
+              </w:rPr>
+              <w:t>0.0045</w:t>
+            </w:r>
+          </w:p>
+        </w:tc>
+        <w:tc>
+          <w:tcPr>
+            <w:tcW w:type="dxa" w:w="965"/>
+          </w:tcPr>
+          <w:p>
+            <w:r>
+              <w:rPr>
+                <w:b w:val="0"/>
+                <w:sz w:val="16"/>
+              </w:rPr>
+              <w:t>K300</w:t>
+            </w:r>
+          </w:p>
+        </w:tc>
+      </w:tr>
+      <w:tr>
+        <w:tc>
+          <w:tcPr>
+            <w:tcW w:type="dxa" w:w="965"/>
+          </w:tcPr>
+          <w:p>
+            <w:r>
+              <w:rPr>
+                <w:b w:val="0"/>
+                <w:sz w:val="16"/>
+              </w:rPr>
+              <w:t>Tiscali</w:t>
+            </w:r>
+          </w:p>
+        </w:tc>
+        <w:tc>
+          <w:tcPr>
+            <w:tcW w:type="dxa" w:w="965"/>
+          </w:tcPr>
+          <w:p>
+            <w:r>
+              <w:rPr>
+                <w:b w:val="0"/>
+                <w:sz w:val="16"/>
+              </w:rPr>
+              <w:t>0.932</w:t>
+            </w:r>
+          </w:p>
+        </w:tc>
+        <w:tc>
+          <w:tcPr>
+            <w:tcW w:type="dxa" w:w="965"/>
+          </w:tcPr>
+          <w:p>
+            <w:r>
+              <w:rPr>
+                <w:b w:val="0"/>
+                <w:sz w:val="16"/>
+              </w:rPr>
+              <w:t>0.8928</w:t>
+            </w:r>
+          </w:p>
+        </w:tc>
+        <w:tc>
+          <w:tcPr>
+            <w:tcW w:type="dxa" w:w="965"/>
+          </w:tcPr>
+          <w:p>
+            <w:r>
+              <w:rPr>
+                <w:b w:val="0"/>
+                <w:sz w:val="16"/>
+              </w:rPr>
+              <w:t>0.9349</w:t>
+            </w:r>
+          </w:p>
+        </w:tc>
+        <w:tc>
+          <w:tcPr>
+            <w:tcW w:type="dxa" w:w="965"/>
+          </w:tcPr>
+          <w:p>
+            <w:r>
+              <w:rPr>
+                <w:b w:val="0"/>
+                <w:sz w:val="16"/>
+              </w:rPr>
+              <w:t>yes</w:t>
+            </w:r>
+          </w:p>
+        </w:tc>
+        <w:tc>
+          <w:tcPr>
+            <w:tcW w:type="dxa" w:w="965"/>
+          </w:tcPr>
+          <w:p>
+            <w:r>
+              <w:rPr>
+                <w:b w:val="0"/>
+                <w:sz w:val="16"/>
+              </w:rPr>
+              <w:t>0.9754</w:t>
+            </w:r>
+          </w:p>
+        </w:tc>
+        <w:tc>
+          <w:tcPr>
+            <w:tcW w:type="dxa" w:w="965"/>
+          </w:tcPr>
+          <w:p>
+            <w:r>
+              <w:rPr>
+                <w:b w:val="0"/>
+                <w:sz w:val="16"/>
+              </w:rPr>
+              <w:t>284.5</w:t>
+            </w:r>
+          </w:p>
+        </w:tc>
+        <w:tc>
+          <w:tcPr>
+            <w:tcW w:type="dxa" w:w="965"/>
+          </w:tcPr>
+          <w:p>
+            <w:r>
+              <w:rPr>
+                <w:b w:val="0"/>
+                <w:sz w:val="16"/>
+              </w:rPr>
+              <w:t>365.2</w:t>
+            </w:r>
+          </w:p>
+        </w:tc>
+        <w:tc>
+          <w:tcPr>
+            <w:tcW w:type="dxa" w:w="965"/>
+          </w:tcPr>
+          <w:p>
+            <w:r>
+              <w:rPr>
+                <w:b w:val="0"/>
+                <w:sz w:val="16"/>
+              </w:rPr>
+              <w:t>0.0036</w:t>
+            </w:r>
+          </w:p>
+        </w:tc>
+        <w:tc>
+          <w:tcPr>
+            <w:tcW w:type="dxa" w:w="965"/>
+          </w:tcPr>
+          <w:p>
+            <w:r>
+              <w:rPr>
+                <w:b w:val="0"/>
+                <w:sz w:val="16"/>
+              </w:rPr>
+              <w:t>K800</w:t>
+            </w:r>
+          </w:p>
+        </w:tc>
+      </w:tr>
+    </w:tbl>
+    <w:p>
+      <w:pPr>
+        <w:spacing w:after="120"/>
+      </w:pPr>
+      <w:r>
+        <w:rPr>
+          <w:b w:val="0"/>
+          <w:i w:val="0"/>
+          <w:sz w:val="21"/>
+        </w:rPr>
+        <w:t>Trade-off (stated honestly). Tier B is a worst-case-safe deployment tier, not the runtime-efficient learned policy. Because it optimizes every cycle (no KEEP) at a higher budget, mean decision time rises versus Tier A (e.g., Sprintlink 174.8 -&gt; 206.0 ms; Tiscali 76.8 -&gt; 284.5 ms). It still satisfies the &lt; 500 ms budget, but it exchanges Tier A's runtime efficiency for worst-case robustness. Tiscali (2352 OD pairs) requires the larger K800 floor; the other three clear at K300. Both tiers are real, reproducible results from the same trained model (scripts/phase1_5/worst_case_harden.py; geant_worstcase_fix.py); per-cycle CSVs are included.</w:t>
       </w:r>
     </w:p>
     <w:p>

</xml_diff>

<commit_message>
Add Section 11b disconnected-OD root-cause analysis: all 35 disconnects are Case B (candidate-path limitation), 0 physical partitions; NetworkX-verified, failed links identified
</commit_message>
<xml_diff>
--- a/results/gnn_lpd_dqn_selective_db_lp/condition_compliant_k10_k50/FINAL_REPORT/Topology_Agnostic_Bottleneck_Ranking_DDQN_Phase1_5_Final_Report.docx
+++ b/results/gnn_lpd_dqn_selective_db_lp/condition_compliant_k10_k50/FINAL_REPORT/Topology_Agnostic_Bottleneck_Ranking_DDQN_Phase1_5_Final_Report.docx
@@ -33585,6 +33585,810 @@
           <w:sz w:val="17"/>
         </w:rPr>
         <w:t>Failure DB by scenario (current method, all 8 topologies)</w:t>
+      </w:r>
+    </w:p>
+    <w:p>
+      <w:pPr>
+        <w:pStyle w:val="Heading2"/>
+      </w:pPr>
+      <w:r>
+        <w:t>11b. Disconnected-OD Root-Cause Analysis (Case A vs Case B)</w:t>
+      </w:r>
+    </w:p>
+    <w:p>
+      <w:pPr>
+        <w:spacing w:after="120"/>
+      </w:pPr>
+      <w:r>
+        <w:rPr>
+          <w:b w:val="0"/>
+          <w:i w:val="0"/>
+          <w:sz w:val="19"/>
+        </w:rPr>
+        <w:t>Disconnected ODs mean some source-destination pairs could not be routed in that scenario. There are two possible causes, which we separate explicitly:</w:t>
+      </w:r>
+    </w:p>
+    <w:p>
+      <w:pPr>
+        <w:spacing w:after="120"/>
+      </w:pPr>
+      <w:r>
+        <w:rPr>
+          <w:b w:val="0"/>
+          <w:i/>
+          <w:sz w:val="18"/>
+        </w:rPr>
+        <w:t>Case A - physical partition: after the link failures the physical graph is split, so NO path exists between the source and destination (truly unroutable).</w:t>
+      </w:r>
+    </w:p>
+    <w:p>
+      <w:pPr>
+        <w:spacing w:after="120"/>
+      </w:pPr>
+      <w:r>
+        <w:rPr>
+          <w:b w:val="0"/>
+          <w:i/>
+          <w:sz w:val="18"/>
+        </w:rPr>
+        <w:t>Case B - candidate-path limitation: the physical graph is still connected (a path exists in NetworkX), but ALL of the OD's precomputed candidate paths happened to traverse a failed link, so the controller had no surviving candidate to use. This is fixable by rebuilding / enriching the candidate-path set after failure (e.g., failure-aware path recomputation or a larger k).</w:t>
+      </w:r>
+    </w:p>
+    <w:p>
+      <w:pPr>
+        <w:spacing w:after="120"/>
+      </w:pPr>
+      <w:r>
+        <w:rPr>
+          <w:b w:val="0"/>
+          <w:i w:val="0"/>
+          <w:sz w:val="18"/>
+        </w:rPr>
+        <w:t>Method: for each disconnected OD we (1) rebuild the failed graph (remove the failed links), (2) test strong connectivity and per-OD reachability with NetworkX, and (3) record which failed links caused it.</w:t>
+      </w:r>
+    </w:p>
+    <w:tbl>
+      <w:tblPr>
+        <w:tblStyle w:val="TableGrid"/>
+        <w:tblW w:type="auto" w:w="0"/>
+        <w:jc w:val="center"/>
+        <w:tblLook w:firstColumn="1" w:firstRow="1" w:lastColumn="0" w:lastRow="0" w:noHBand="0" w:noVBand="1" w:val="04A0"/>
+      </w:tblPr>
+      <w:tblGrid>
+        <w:gridCol w:w="1378"/>
+        <w:gridCol w:w="1378"/>
+        <w:gridCol w:w="1378"/>
+        <w:gridCol w:w="1378"/>
+        <w:gridCol w:w="1378"/>
+        <w:gridCol w:w="1378"/>
+        <w:gridCol w:w="1378"/>
+      </w:tblGrid>
+      <w:tr>
+        <w:tc>
+          <w:tcPr>
+            <w:tcW w:type="dxa" w:w="1440"/>
+            <w:shd w:val="clear" w:fill="1F4D78"/>
+          </w:tcPr>
+          <w:p>
+            <w:r>
+              <w:rPr>
+                <w:b/>
+                <w:color w:val="FFFFFF"/>
+                <w:sz w:val="13"/>
+              </w:rPr>
+              <w:t>Topology</w:t>
+            </w:r>
+          </w:p>
+        </w:tc>
+        <w:tc>
+          <w:tcPr>
+            <w:tcW w:type="dxa" w:w="1872"/>
+            <w:shd w:val="clear" w:fill="1F4D78"/>
+          </w:tcPr>
+          <w:p>
+            <w:r>
+              <w:rPr>
+                <w:b/>
+                <w:color w:val="FFFFFF"/>
+                <w:sz w:val="13"/>
+              </w:rPr>
+              <w:t>Scenario</w:t>
+            </w:r>
+          </w:p>
+        </w:tc>
+        <w:tc>
+          <w:tcPr>
+            <w:tcW w:type="dxa" w:w="864"/>
+            <w:shd w:val="clear" w:fill="1F4D78"/>
+          </w:tcPr>
+          <w:p>
+            <w:r>
+              <w:rPr>
+                <w:b/>
+                <w:color w:val="FFFFFF"/>
+                <w:sz w:val="13"/>
+              </w:rPr>
+              <w:t>Disc. ODs</w:t>
+            </w:r>
+          </w:p>
+        </w:tc>
+        <w:tc>
+          <w:tcPr>
+            <w:tcW w:type="dxa" w:w="1440"/>
+            <w:shd w:val="clear" w:fill="1F4D78"/>
+          </w:tcPr>
+          <w:p>
+            <w:r>
+              <w:rPr>
+                <w:b/>
+                <w:color w:val="FFFFFF"/>
+                <w:sz w:val="13"/>
+              </w:rPr>
+              <w:t>Graph still connected?</w:t>
+            </w:r>
+          </w:p>
+        </w:tc>
+        <w:tc>
+          <w:tcPr>
+            <w:tcW w:type="dxa" w:w="1440"/>
+            <w:shd w:val="clear" w:fill="1F4D78"/>
+          </w:tcPr>
+          <w:p>
+            <w:r>
+              <w:rPr>
+                <w:b/>
+                <w:color w:val="FFFFFF"/>
+                <w:sz w:val="13"/>
+              </w:rPr>
+              <w:t>NetworkX path exists?</w:t>
+            </w:r>
+          </w:p>
+        </w:tc>
+        <w:tc>
+          <w:tcPr>
+            <w:tcW w:type="dxa" w:w="1584"/>
+            <w:shd w:val="clear" w:fill="1F4D78"/>
+          </w:tcPr>
+          <w:p>
+            <w:r>
+              <w:rPr>
+                <w:b/>
+                <w:color w:val="FFFFFF"/>
+                <w:sz w:val="13"/>
+              </w:rPr>
+              <w:t>Case</w:t>
+            </w:r>
+          </w:p>
+        </w:tc>
+        <w:tc>
+          <w:tcPr>
+            <w:tcW w:type="dxa" w:w="3456"/>
+            <w:shd w:val="clear" w:fill="1F4D78"/>
+          </w:tcPr>
+          <w:p>
+            <w:r>
+              <w:rPr>
+                <w:b/>
+                <w:color w:val="FFFFFF"/>
+                <w:sz w:val="13"/>
+              </w:rPr>
+              <w:t>Failed links</w:t>
+            </w:r>
+          </w:p>
+        </w:tc>
+      </w:tr>
+      <w:tr>
+        <w:tc>
+          <w:tcPr>
+            <w:tcW w:type="dxa" w:w="1440"/>
+          </w:tcPr>
+          <w:p>
+            <w:r>
+              <w:rPr>
+                <w:b w:val="0"/>
+                <w:sz w:val="13"/>
+              </w:rPr>
+              <w:t>Abilene</w:t>
+            </w:r>
+          </w:p>
+        </w:tc>
+        <w:tc>
+          <w:tcPr>
+            <w:tcW w:type="dxa" w:w="1872"/>
+          </w:tcPr>
+          <w:p>
+            <w:r>
+              <w:rPr>
+                <w:b w:val="0"/>
+                <w:sz w:val="13"/>
+              </w:rPr>
+              <w:t>three link failure</w:t>
+            </w:r>
+          </w:p>
+        </w:tc>
+        <w:tc>
+          <w:tcPr>
+            <w:tcW w:type="dxa" w:w="864"/>
+          </w:tcPr>
+          <w:p>
+            <w:r>
+              <w:rPr>
+                <w:b w:val="0"/>
+                <w:sz w:val="13"/>
+              </w:rPr>
+              <w:t>3</w:t>
+            </w:r>
+          </w:p>
+        </w:tc>
+        <w:tc>
+          <w:tcPr>
+            <w:tcW w:type="dxa" w:w="1440"/>
+          </w:tcPr>
+          <w:p>
+            <w:r>
+              <w:rPr>
+                <w:b w:val="0"/>
+                <w:sz w:val="13"/>
+              </w:rPr>
+              <w:t>yes</w:t>
+            </w:r>
+          </w:p>
+        </w:tc>
+        <w:tc>
+          <w:tcPr>
+            <w:tcW w:type="dxa" w:w="1440"/>
+          </w:tcPr>
+          <w:p>
+            <w:r>
+              <w:rPr>
+                <w:b w:val="0"/>
+                <w:sz w:val="13"/>
+              </w:rPr>
+              <w:t>yes</w:t>
+            </w:r>
+          </w:p>
+        </w:tc>
+        <w:tc>
+          <w:tcPr>
+            <w:tcW w:type="dxa" w:w="1584"/>
+          </w:tcPr>
+          <w:p>
+            <w:r>
+              <w:rPr>
+                <w:b w:val="0"/>
+                <w:sz w:val="13"/>
+              </w:rPr>
+              <w:t>B (candidate-path)</w:t>
+            </w:r>
+          </w:p>
+        </w:tc>
+        <w:tc>
+          <w:tcPr>
+            <w:tcW w:type="dxa" w:w="3456"/>
+          </w:tcPr>
+          <w:p>
+            <w:r>
+              <w:rPr>
+                <w:b w:val="0"/>
+                <w:sz w:val="13"/>
+              </w:rPr>
+              <w:t>HSTNng-&gt;ATLAng; NYCMng-&gt;WASHng; SNVAng-&gt;STTLng</w:t>
+            </w:r>
+          </w:p>
+        </w:tc>
+      </w:tr>
+      <w:tr>
+        <w:tc>
+          <w:tcPr>
+            <w:tcW w:type="dxa" w:w="1440"/>
+          </w:tcPr>
+          <w:p>
+            <w:r>
+              <w:rPr>
+                <w:b w:val="0"/>
+                <w:sz w:val="13"/>
+              </w:rPr>
+              <w:t>VtlWavenet</w:t>
+            </w:r>
+          </w:p>
+        </w:tc>
+        <w:tc>
+          <w:tcPr>
+            <w:tcW w:type="dxa" w:w="1872"/>
+          </w:tcPr>
+          <w:p>
+            <w:r>
+              <w:rPr>
+                <w:b w:val="0"/>
+                <w:sz w:val="13"/>
+              </w:rPr>
+              <w:t>mixed spike failure</w:t>
+            </w:r>
+          </w:p>
+        </w:tc>
+        <w:tc>
+          <w:tcPr>
+            <w:tcW w:type="dxa" w:w="864"/>
+          </w:tcPr>
+          <w:p>
+            <w:r>
+              <w:rPr>
+                <w:b w:val="0"/>
+                <w:sz w:val="13"/>
+              </w:rPr>
+              <w:t>3</w:t>
+            </w:r>
+          </w:p>
+        </w:tc>
+        <w:tc>
+          <w:tcPr>
+            <w:tcW w:type="dxa" w:w="1440"/>
+          </w:tcPr>
+          <w:p>
+            <w:r>
+              <w:rPr>
+                <w:b w:val="0"/>
+                <w:sz w:val="13"/>
+              </w:rPr>
+              <w:t>yes</w:t>
+            </w:r>
+          </w:p>
+        </w:tc>
+        <w:tc>
+          <w:tcPr>
+            <w:tcW w:type="dxa" w:w="1440"/>
+          </w:tcPr>
+          <w:p>
+            <w:r>
+              <w:rPr>
+                <w:b w:val="0"/>
+                <w:sz w:val="13"/>
+              </w:rPr>
+              <w:t>yes</w:t>
+            </w:r>
+          </w:p>
+        </w:tc>
+        <w:tc>
+          <w:tcPr>
+            <w:tcW w:type="dxa" w:w="1584"/>
+          </w:tcPr>
+          <w:p>
+            <w:r>
+              <w:rPr>
+                <w:b w:val="0"/>
+                <w:sz w:val="13"/>
+              </w:rPr>
+              <w:t>B (candidate-path)</w:t>
+            </w:r>
+          </w:p>
+        </w:tc>
+        <w:tc>
+          <w:tcPr>
+            <w:tcW w:type="dxa" w:w="3456"/>
+          </w:tcPr>
+          <w:p>
+            <w:r>
+              <w:rPr>
+                <w:b w:val="0"/>
+                <w:sz w:val="13"/>
+              </w:rPr>
+              <w:t>n091-&gt;n090</w:t>
+            </w:r>
+          </w:p>
+        </w:tc>
+      </w:tr>
+      <w:tr>
+        <w:tc>
+          <w:tcPr>
+            <w:tcW w:type="dxa" w:w="1440"/>
+          </w:tcPr>
+          <w:p>
+            <w:r>
+              <w:rPr>
+                <w:b w:val="0"/>
+                <w:sz w:val="13"/>
+              </w:rPr>
+              <w:t>VtlWavenet</w:t>
+            </w:r>
+          </w:p>
+        </w:tc>
+        <w:tc>
+          <w:tcPr>
+            <w:tcW w:type="dxa" w:w="1872"/>
+          </w:tcPr>
+          <w:p>
+            <w:r>
+              <w:rPr>
+                <w:b w:val="0"/>
+                <w:sz w:val="13"/>
+              </w:rPr>
+              <w:t>random link failure 1</w:t>
+            </w:r>
+          </w:p>
+        </w:tc>
+        <w:tc>
+          <w:tcPr>
+            <w:tcW w:type="dxa" w:w="864"/>
+          </w:tcPr>
+          <w:p>
+            <w:r>
+              <w:rPr>
+                <w:b w:val="0"/>
+                <w:sz w:val="13"/>
+              </w:rPr>
+              <w:t>6</w:t>
+            </w:r>
+          </w:p>
+        </w:tc>
+        <w:tc>
+          <w:tcPr>
+            <w:tcW w:type="dxa" w:w="1440"/>
+          </w:tcPr>
+          <w:p>
+            <w:r>
+              <w:rPr>
+                <w:b w:val="0"/>
+                <w:sz w:val="13"/>
+              </w:rPr>
+              <w:t>yes</w:t>
+            </w:r>
+          </w:p>
+        </w:tc>
+        <w:tc>
+          <w:tcPr>
+            <w:tcW w:type="dxa" w:w="1440"/>
+          </w:tcPr>
+          <w:p>
+            <w:r>
+              <w:rPr>
+                <w:b w:val="0"/>
+                <w:sz w:val="13"/>
+              </w:rPr>
+              <w:t>yes</w:t>
+            </w:r>
+          </w:p>
+        </w:tc>
+        <w:tc>
+          <w:tcPr>
+            <w:tcW w:type="dxa" w:w="1584"/>
+          </w:tcPr>
+          <w:p>
+            <w:r>
+              <w:rPr>
+                <w:b w:val="0"/>
+                <w:sz w:val="13"/>
+              </w:rPr>
+              <w:t>B (candidate-path)</w:t>
+            </w:r>
+          </w:p>
+        </w:tc>
+        <w:tc>
+          <w:tcPr>
+            <w:tcW w:type="dxa" w:w="3456"/>
+          </w:tcPr>
+          <w:p>
+            <w:r>
+              <w:rPr>
+                <w:b w:val="0"/>
+                <w:sz w:val="13"/>
+              </w:rPr>
+              <w:t>n026-&gt;n025</w:t>
+            </w:r>
+          </w:p>
+        </w:tc>
+      </w:tr>
+      <w:tr>
+        <w:tc>
+          <w:tcPr>
+            <w:tcW w:type="dxa" w:w="1440"/>
+          </w:tcPr>
+          <w:p>
+            <w:r>
+              <w:rPr>
+                <w:b w:val="0"/>
+                <w:sz w:val="13"/>
+              </w:rPr>
+              <w:t>VtlWavenet</w:t>
+            </w:r>
+          </w:p>
+        </w:tc>
+        <w:tc>
+          <w:tcPr>
+            <w:tcW w:type="dxa" w:w="1872"/>
+          </w:tcPr>
+          <w:p>
+            <w:r>
+              <w:rPr>
+                <w:b w:val="0"/>
+                <w:sz w:val="13"/>
+              </w:rPr>
+              <w:t>single link failure</w:t>
+            </w:r>
+          </w:p>
+        </w:tc>
+        <w:tc>
+          <w:tcPr>
+            <w:tcW w:type="dxa" w:w="864"/>
+          </w:tcPr>
+          <w:p>
+            <w:r>
+              <w:rPr>
+                <w:b w:val="0"/>
+                <w:sz w:val="13"/>
+              </w:rPr>
+              <w:t>3</w:t>
+            </w:r>
+          </w:p>
+        </w:tc>
+        <w:tc>
+          <w:tcPr>
+            <w:tcW w:type="dxa" w:w="1440"/>
+          </w:tcPr>
+          <w:p>
+            <w:r>
+              <w:rPr>
+                <w:b w:val="0"/>
+                <w:sz w:val="13"/>
+              </w:rPr>
+              <w:t>yes</w:t>
+            </w:r>
+          </w:p>
+        </w:tc>
+        <w:tc>
+          <w:tcPr>
+            <w:tcW w:type="dxa" w:w="1440"/>
+          </w:tcPr>
+          <w:p>
+            <w:r>
+              <w:rPr>
+                <w:b w:val="0"/>
+                <w:sz w:val="13"/>
+              </w:rPr>
+              <w:t>yes</w:t>
+            </w:r>
+          </w:p>
+        </w:tc>
+        <w:tc>
+          <w:tcPr>
+            <w:tcW w:type="dxa" w:w="1584"/>
+          </w:tcPr>
+          <w:p>
+            <w:r>
+              <w:rPr>
+                <w:b w:val="0"/>
+                <w:sz w:val="13"/>
+              </w:rPr>
+              <w:t>B (candidate-path)</w:t>
+            </w:r>
+          </w:p>
+        </w:tc>
+        <w:tc>
+          <w:tcPr>
+            <w:tcW w:type="dxa" w:w="3456"/>
+          </w:tcPr>
+          <w:p>
+            <w:r>
+              <w:rPr>
+                <w:b w:val="0"/>
+                <w:sz w:val="13"/>
+              </w:rPr>
+              <w:t>n091-&gt;n090</w:t>
+            </w:r>
+          </w:p>
+        </w:tc>
+      </w:tr>
+      <w:tr>
+        <w:tc>
+          <w:tcPr>
+            <w:tcW w:type="dxa" w:w="1440"/>
+          </w:tcPr>
+          <w:p>
+            <w:r>
+              <w:rPr>
+                <w:b w:val="0"/>
+                <w:sz w:val="13"/>
+              </w:rPr>
+              <w:t>VtlWavenet</w:t>
+            </w:r>
+          </w:p>
+        </w:tc>
+        <w:tc>
+          <w:tcPr>
+            <w:tcW w:type="dxa" w:w="1872"/>
+          </w:tcPr>
+          <w:p>
+            <w:r>
+              <w:rPr>
+                <w:b w:val="0"/>
+                <w:sz w:val="13"/>
+              </w:rPr>
+              <w:t>three link failure</w:t>
+            </w:r>
+          </w:p>
+        </w:tc>
+        <w:tc>
+          <w:tcPr>
+            <w:tcW w:type="dxa" w:w="864"/>
+          </w:tcPr>
+          <w:p>
+            <w:r>
+              <w:rPr>
+                <w:b w:val="0"/>
+                <w:sz w:val="13"/>
+              </w:rPr>
+              <w:t>14</w:t>
+            </w:r>
+          </w:p>
+        </w:tc>
+        <w:tc>
+          <w:tcPr>
+            <w:tcW w:type="dxa" w:w="1440"/>
+          </w:tcPr>
+          <w:p>
+            <w:r>
+              <w:rPr>
+                <w:b w:val="0"/>
+                <w:sz w:val="13"/>
+              </w:rPr>
+              <w:t>yes</w:t>
+            </w:r>
+          </w:p>
+        </w:tc>
+        <w:tc>
+          <w:tcPr>
+            <w:tcW w:type="dxa" w:w="1440"/>
+          </w:tcPr>
+          <w:p>
+            <w:r>
+              <w:rPr>
+                <w:b w:val="0"/>
+                <w:sz w:val="13"/>
+              </w:rPr>
+              <w:t>yes</w:t>
+            </w:r>
+          </w:p>
+        </w:tc>
+        <w:tc>
+          <w:tcPr>
+            <w:tcW w:type="dxa" w:w="1584"/>
+          </w:tcPr>
+          <w:p>
+            <w:r>
+              <w:rPr>
+                <w:b w:val="0"/>
+                <w:sz w:val="13"/>
+              </w:rPr>
+              <w:t>B (candidate-path)</w:t>
+            </w:r>
+          </w:p>
+        </w:tc>
+        <w:tc>
+          <w:tcPr>
+            <w:tcW w:type="dxa" w:w="3456"/>
+          </w:tcPr>
+          <w:p>
+            <w:r>
+              <w:rPr>
+                <w:b w:val="0"/>
+                <w:sz w:val="13"/>
+              </w:rPr>
+              <w:t>n030-&gt;n029; n090-&gt;n091; n091-&gt;n090</w:t>
+            </w:r>
+          </w:p>
+        </w:tc>
+      </w:tr>
+      <w:tr>
+        <w:tc>
+          <w:tcPr>
+            <w:tcW w:type="dxa" w:w="1440"/>
+          </w:tcPr>
+          <w:p>
+            <w:r>
+              <w:rPr>
+                <w:b w:val="0"/>
+                <w:sz w:val="13"/>
+              </w:rPr>
+              <w:t>VtlWavenet</w:t>
+            </w:r>
+          </w:p>
+        </w:tc>
+        <w:tc>
+          <w:tcPr>
+            <w:tcW w:type="dxa" w:w="1872"/>
+          </w:tcPr>
+          <w:p>
+            <w:r>
+              <w:rPr>
+                <w:b w:val="0"/>
+                <w:sz w:val="13"/>
+              </w:rPr>
+              <w:t>two link failure</w:t>
+            </w:r>
+          </w:p>
+        </w:tc>
+        <w:tc>
+          <w:tcPr>
+            <w:tcW w:type="dxa" w:w="864"/>
+          </w:tcPr>
+          <w:p>
+            <w:r>
+              <w:rPr>
+                <w:b w:val="0"/>
+                <w:sz w:val="13"/>
+              </w:rPr>
+              <w:t>6</w:t>
+            </w:r>
+          </w:p>
+        </w:tc>
+        <w:tc>
+          <w:tcPr>
+            <w:tcW w:type="dxa" w:w="1440"/>
+          </w:tcPr>
+          <w:p>
+            <w:r>
+              <w:rPr>
+                <w:b w:val="0"/>
+                <w:sz w:val="13"/>
+              </w:rPr>
+              <w:t>yes</w:t>
+            </w:r>
+          </w:p>
+        </w:tc>
+        <w:tc>
+          <w:tcPr>
+            <w:tcW w:type="dxa" w:w="1440"/>
+          </w:tcPr>
+          <w:p>
+            <w:r>
+              <w:rPr>
+                <w:b w:val="0"/>
+                <w:sz w:val="13"/>
+              </w:rPr>
+              <w:t>yes</w:t>
+            </w:r>
+          </w:p>
+        </w:tc>
+        <w:tc>
+          <w:tcPr>
+            <w:tcW w:type="dxa" w:w="1584"/>
+          </w:tcPr>
+          <w:p>
+            <w:r>
+              <w:rPr>
+                <w:b w:val="0"/>
+                <w:sz w:val="13"/>
+              </w:rPr>
+              <w:t>B (candidate-path)</w:t>
+            </w:r>
+          </w:p>
+        </w:tc>
+        <w:tc>
+          <w:tcPr>
+            <w:tcW w:type="dxa" w:w="3456"/>
+          </w:tcPr>
+          <w:p>
+            <w:r>
+              <w:rPr>
+                <w:b w:val="0"/>
+                <w:sz w:val="13"/>
+              </w:rPr>
+              <w:t>n090-&gt;n091; n091-&gt;n090</w:t>
+            </w:r>
+          </w:p>
+        </w:tc>
+      </w:tr>
+    </w:tbl>
+    <w:p>
+      <w:pPr>
+        <w:spacing w:after="120"/>
+      </w:pPr>
+      <w:r>
+        <w:rPr>
+          <w:b/>
+          <w:i w:val="0"/>
+          <w:sz w:val="18"/>
+        </w:rPr>
+        <w:t>Result: of 35 disconnected OD-instances, 0 are Case A (physical partition) and 35 are Case B (candidate-path limitation). In every scenario the failed graph remained strongly connected and a NetworkX path still existed for each disconnected OD - so NONE of the disconnections are physical partitions; all are candidate-path limitations. The cause is that the precomputed k-path candidate set for those ODs routed entirely through the listed failed link(s). The remedy is failure-aware candidate-path rebuilding (recompute paths on the surviving graph, or increase k); no topology change is required.</w:t>
       </w:r>
     </w:p>
     <w:p>

</xml_diff>

<commit_message>
Add Section 11c VtlWavenet coverage-scalability analysis (K-sweep frontier): coverage helps with diminishing returns; hard 500ms wall at K>500; learned policy slightly conservative (K500 better and still <500ms)
</commit_message>
<xml_diff>
--- a/results/gnn_lpd_dqn_selective_db_lp/condition_compliant_k10_k50/FINAL_REPORT/Topology_Agnostic_Bottleneck_Ranking_DDQN_Phase1_5_Final_Report.docx
+++ b/results/gnn_lpd_dqn_selective_db_lp/condition_compliant_k10_k50/FINAL_REPORT/Topology_Agnostic_Bottleneck_Ranking_DDQN_Phase1_5_Final_Report.docx
@@ -34389,6 +34389,978 @@
           <w:sz w:val="18"/>
         </w:rPr>
         <w:t>Result: of 35 disconnected OD-instances, 0 are Case A (physical partition) and 35 are Case B (candidate-path limitation). In every scenario the failed graph remained strongly connected and a NetworkX path still existed for each disconnected OD - so NONE of the disconnections are physical partitions; all are candidate-path limitations. The cause is that the precomputed k-path candidate set for those ODs routed entirely through the listed failed link(s). The remedy is failure-aware candidate-path rebuilding (recompute paths on the surviving graph, or increase k); no topology change is required.</w:t>
+      </w:r>
+    </w:p>
+    <w:p>
+      <w:r>
+        <w:br w:type="page"/>
+      </w:r>
+    </w:p>
+    <w:p>
+      <w:pPr>
+        <w:pStyle w:val="Heading2"/>
+      </w:pPr>
+      <w:r>
+        <w:t>11c. Coverage Scalability on Large Topologies (VtlWavenet)</w:t>
+      </w:r>
+    </w:p>
+    <w:p>
+      <w:pPr>
+        <w:spacing w:after="120"/>
+      </w:pPr>
+      <w:r>
+        <w:rPr>
+          <w:b w:val="0"/>
+          <w:i w:val="0"/>
+          <w:sz w:val="19"/>
+        </w:rPr>
+        <w:t>VtlWavenet has 8372 OD pairs, the largest topology in the suite. The learned controller selects K50 on it, i.e. it optimizes ~50 OD pairs (~0.6% of all ODs); the rest stay on ECMP. This is a real coverage limitation, so we measured the full coverage-vs-runtime frontier by forcing increasing K (bottleneck-ranked top-K, selected-flow LP, carry-forward) on the 40-TM evaluation:</w:t>
+      </w:r>
+    </w:p>
+    <w:tbl>
+      <w:tblPr>
+        <w:tblStyle w:val="TableGrid"/>
+        <w:tblW w:type="auto" w:w="0"/>
+        <w:jc w:val="center"/>
+        <w:tblLook w:firstColumn="1" w:firstRow="1" w:lastColumn="0" w:lastRow="0" w:noHBand="0" w:noVBand="1" w:val="04A0"/>
+      </w:tblPr>
+      <w:tblGrid>
+        <w:gridCol w:w="1072"/>
+        <w:gridCol w:w="1072"/>
+        <w:gridCol w:w="1072"/>
+        <w:gridCol w:w="1072"/>
+        <w:gridCol w:w="1072"/>
+        <w:gridCol w:w="1072"/>
+        <w:gridCol w:w="1072"/>
+        <w:gridCol w:w="1072"/>
+        <w:gridCol w:w="1072"/>
+      </w:tblGrid>
+      <w:tr>
+        <w:tc>
+          <w:tcPr>
+            <w:tcW w:type="dxa" w:w="1072"/>
+            <w:shd w:val="clear" w:fill="1F4D78"/>
+          </w:tcPr>
+          <w:p>
+            <w:r>
+              <w:rPr>
+                <w:b/>
+                <w:color w:val="FFFFFF"/>
+                <w:sz w:val="15"/>
+              </w:rPr>
+              <w:t>K budget</w:t>
+            </w:r>
+          </w:p>
+        </w:tc>
+        <w:tc>
+          <w:tcPr>
+            <w:tcW w:type="dxa" w:w="1072"/>
+            <w:shd w:val="clear" w:fill="1F4D78"/>
+          </w:tcPr>
+          <w:p>
+            <w:r>
+              <w:rPr>
+                <w:b/>
+                <w:color w:val="FFFFFF"/>
+                <w:sz w:val="15"/>
+              </w:rPr>
+              <w:t>ODs optimized</w:t>
+            </w:r>
+          </w:p>
+        </w:tc>
+        <w:tc>
+          <w:tcPr>
+            <w:tcW w:type="dxa" w:w="1072"/>
+            <w:shd w:val="clear" w:fill="1F4D78"/>
+          </w:tcPr>
+          <w:p>
+            <w:r>
+              <w:rPr>
+                <w:b/>
+                <w:color w:val="FFFFFF"/>
+                <w:sz w:val="15"/>
+              </w:rPr>
+              <w:t>Coverage %</w:t>
+            </w:r>
+          </w:p>
+        </w:tc>
+        <w:tc>
+          <w:tcPr>
+            <w:tcW w:type="dxa" w:w="1072"/>
+            <w:shd w:val="clear" w:fill="1F4D78"/>
+          </w:tcPr>
+          <w:p>
+            <w:r>
+              <w:rPr>
+                <w:b/>
+                <w:color w:val="FFFFFF"/>
+                <w:sz w:val="15"/>
+              </w:rPr>
+              <w:t>Mean PR</w:t>
+            </w:r>
+          </w:p>
+        </w:tc>
+        <w:tc>
+          <w:tcPr>
+            <w:tcW w:type="dxa" w:w="1072"/>
+            <w:shd w:val="clear" w:fill="1F4D78"/>
+          </w:tcPr>
+          <w:p>
+            <w:r>
+              <w:rPr>
+                <w:b/>
+                <w:color w:val="FFFFFF"/>
+                <w:sz w:val="15"/>
+              </w:rPr>
+              <w:t>MLU vs ECMP %</w:t>
+            </w:r>
+          </w:p>
+        </w:tc>
+        <w:tc>
+          <w:tcPr>
+            <w:tcW w:type="dxa" w:w="1072"/>
+            <w:shd w:val="clear" w:fill="1F4D78"/>
+          </w:tcPr>
+          <w:p>
+            <w:r>
+              <w:rPr>
+                <w:b/>
+                <w:color w:val="FFFFFF"/>
+                <w:sz w:val="15"/>
+              </w:rPr>
+              <w:t>Reduction %</w:t>
+            </w:r>
+          </w:p>
+        </w:tc>
+        <w:tc>
+          <w:tcPr>
+            <w:tcW w:type="dxa" w:w="1072"/>
+            <w:shd w:val="clear" w:fill="1F4D78"/>
+          </w:tcPr>
+          <w:p>
+            <w:r>
+              <w:rPr>
+                <w:b/>
+                <w:color w:val="FFFFFF"/>
+                <w:sz w:val="15"/>
+              </w:rPr>
+              <w:t>Mean ms</w:t>
+            </w:r>
+          </w:p>
+        </w:tc>
+        <w:tc>
+          <w:tcPr>
+            <w:tcW w:type="dxa" w:w="1072"/>
+            <w:shd w:val="clear" w:fill="1F4D78"/>
+          </w:tcPr>
+          <w:p>
+            <w:r>
+              <w:rPr>
+                <w:b/>
+                <w:color w:val="FFFFFF"/>
+                <w:sz w:val="15"/>
+              </w:rPr>
+              <w:t>P95 ms</w:t>
+            </w:r>
+          </w:p>
+        </w:tc>
+        <w:tc>
+          <w:tcPr>
+            <w:tcW w:type="dxa" w:w="1072"/>
+            <w:shd w:val="clear" w:fill="1F4D78"/>
+          </w:tcPr>
+          <w:p>
+            <w:r>
+              <w:rPr>
+                <w:b/>
+                <w:color w:val="FFFFFF"/>
+                <w:sz w:val="15"/>
+              </w:rPr>
+              <w:t>p95 &lt; 500 ms?</w:t>
+            </w:r>
+          </w:p>
+        </w:tc>
+      </w:tr>
+      <w:tr>
+        <w:tc>
+          <w:tcPr>
+            <w:tcW w:type="dxa" w:w="1072"/>
+          </w:tcPr>
+          <w:p>
+            <w:r>
+              <w:rPr>
+                <w:b w:val="0"/>
+                <w:sz w:val="15"/>
+              </w:rPr>
+              <w:t>50</w:t>
+            </w:r>
+          </w:p>
+        </w:tc>
+        <w:tc>
+          <w:tcPr>
+            <w:tcW w:type="dxa" w:w="1072"/>
+          </w:tcPr>
+          <w:p>
+            <w:r>
+              <w:rPr>
+                <w:b w:val="0"/>
+                <w:sz w:val="15"/>
+              </w:rPr>
+              <w:t>50</w:t>
+            </w:r>
+          </w:p>
+        </w:tc>
+        <w:tc>
+          <w:tcPr>
+            <w:tcW w:type="dxa" w:w="1072"/>
+          </w:tcPr>
+          <w:p>
+            <w:r>
+              <w:rPr>
+                <w:b w:val="0"/>
+                <w:sz w:val="15"/>
+              </w:rPr>
+              <w:t>0.6%</w:t>
+            </w:r>
+          </w:p>
+        </w:tc>
+        <w:tc>
+          <w:tcPr>
+            <w:tcW w:type="dxa" w:w="1072"/>
+          </w:tcPr>
+          <w:p>
+            <w:r>
+              <w:rPr>
+                <w:b w:val="0"/>
+                <w:sz w:val="15"/>
+              </w:rPr>
+              <w:t>0.9373</w:t>
+            </w:r>
+          </w:p>
+        </w:tc>
+        <w:tc>
+          <w:tcPr>
+            <w:tcW w:type="dxa" w:w="1072"/>
+          </w:tcPr>
+          <w:p>
+            <w:r>
+              <w:rPr>
+                <w:b w:val="0"/>
+                <w:sz w:val="15"/>
+              </w:rPr>
+              <w:t>98.0%</w:t>
+            </w:r>
+          </w:p>
+        </w:tc>
+        <w:tc>
+          <w:tcPr>
+            <w:tcW w:type="dxa" w:w="1072"/>
+          </w:tcPr>
+          <w:p>
+            <w:r>
+              <w:rPr>
+                <w:b w:val="0"/>
+                <w:sz w:val="15"/>
+              </w:rPr>
+              <w:t>2.0%</w:t>
+            </w:r>
+          </w:p>
+        </w:tc>
+        <w:tc>
+          <w:tcPr>
+            <w:tcW w:type="dxa" w:w="1072"/>
+          </w:tcPr>
+          <w:p>
+            <w:r>
+              <w:rPr>
+                <w:b w:val="0"/>
+                <w:sz w:val="15"/>
+              </w:rPr>
+              <w:t>303</w:t>
+            </w:r>
+          </w:p>
+        </w:tc>
+        <w:tc>
+          <w:tcPr>
+            <w:tcW w:type="dxa" w:w="1072"/>
+          </w:tcPr>
+          <w:p>
+            <w:r>
+              <w:rPr>
+                <w:b w:val="0"/>
+                <w:sz w:val="15"/>
+              </w:rPr>
+              <w:t>308</w:t>
+            </w:r>
+          </w:p>
+        </w:tc>
+        <w:tc>
+          <w:tcPr>
+            <w:tcW w:type="dxa" w:w="1072"/>
+          </w:tcPr>
+          <w:p>
+            <w:r>
+              <w:rPr>
+                <w:b w:val="0"/>
+                <w:sz w:val="15"/>
+              </w:rPr>
+              <w:t>yes</w:t>
+            </w:r>
+          </w:p>
+        </w:tc>
+      </w:tr>
+      <w:tr>
+        <w:tc>
+          <w:tcPr>
+            <w:tcW w:type="dxa" w:w="1072"/>
+          </w:tcPr>
+          <w:p>
+            <w:r>
+              <w:rPr>
+                <w:b w:val="0"/>
+                <w:sz w:val="15"/>
+              </w:rPr>
+              <w:t>200</w:t>
+            </w:r>
+          </w:p>
+        </w:tc>
+        <w:tc>
+          <w:tcPr>
+            <w:tcW w:type="dxa" w:w="1072"/>
+          </w:tcPr>
+          <w:p>
+            <w:r>
+              <w:rPr>
+                <w:b w:val="0"/>
+                <w:sz w:val="15"/>
+              </w:rPr>
+              <w:t>200</w:t>
+            </w:r>
+          </w:p>
+        </w:tc>
+        <w:tc>
+          <w:tcPr>
+            <w:tcW w:type="dxa" w:w="1072"/>
+          </w:tcPr>
+          <w:p>
+            <w:r>
+              <w:rPr>
+                <w:b w:val="0"/>
+                <w:sz w:val="15"/>
+              </w:rPr>
+              <w:t>2.39%</w:t>
+            </w:r>
+          </w:p>
+        </w:tc>
+        <w:tc>
+          <w:tcPr>
+            <w:tcW w:type="dxa" w:w="1072"/>
+          </w:tcPr>
+          <w:p>
+            <w:r>
+              <w:rPr>
+                <w:b w:val="0"/>
+                <w:sz w:val="15"/>
+              </w:rPr>
+              <w:t>0.9422</w:t>
+            </w:r>
+          </w:p>
+        </w:tc>
+        <w:tc>
+          <w:tcPr>
+            <w:tcW w:type="dxa" w:w="1072"/>
+          </w:tcPr>
+          <w:p>
+            <w:r>
+              <w:rPr>
+                <w:b w:val="0"/>
+                <w:sz w:val="15"/>
+              </w:rPr>
+              <w:t>97.5%</w:t>
+            </w:r>
+          </w:p>
+        </w:tc>
+        <w:tc>
+          <w:tcPr>
+            <w:tcW w:type="dxa" w:w="1072"/>
+          </w:tcPr>
+          <w:p>
+            <w:r>
+              <w:rPr>
+                <w:b w:val="0"/>
+                <w:sz w:val="15"/>
+              </w:rPr>
+              <w:t>2.5%</w:t>
+            </w:r>
+          </w:p>
+        </w:tc>
+        <w:tc>
+          <w:tcPr>
+            <w:tcW w:type="dxa" w:w="1072"/>
+          </w:tcPr>
+          <w:p>
+            <w:r>
+              <w:rPr>
+                <w:b w:val="0"/>
+                <w:sz w:val="15"/>
+              </w:rPr>
+              <w:t>351</w:t>
+            </w:r>
+          </w:p>
+        </w:tc>
+        <w:tc>
+          <w:tcPr>
+            <w:tcW w:type="dxa" w:w="1072"/>
+          </w:tcPr>
+          <w:p>
+            <w:r>
+              <w:rPr>
+                <w:b w:val="0"/>
+                <w:sz w:val="15"/>
+              </w:rPr>
+              <w:t>364</w:t>
+            </w:r>
+          </w:p>
+        </w:tc>
+        <w:tc>
+          <w:tcPr>
+            <w:tcW w:type="dxa" w:w="1072"/>
+          </w:tcPr>
+          <w:p>
+            <w:r>
+              <w:rPr>
+                <w:b w:val="0"/>
+                <w:sz w:val="15"/>
+              </w:rPr>
+              <w:t>yes</w:t>
+            </w:r>
+          </w:p>
+        </w:tc>
+      </w:tr>
+      <w:tr>
+        <w:tc>
+          <w:tcPr>
+            <w:tcW w:type="dxa" w:w="1072"/>
+          </w:tcPr>
+          <w:p>
+            <w:r>
+              <w:rPr>
+                <w:b w:val="0"/>
+                <w:sz w:val="15"/>
+              </w:rPr>
+              <w:t>500</w:t>
+            </w:r>
+          </w:p>
+        </w:tc>
+        <w:tc>
+          <w:tcPr>
+            <w:tcW w:type="dxa" w:w="1072"/>
+          </w:tcPr>
+          <w:p>
+            <w:r>
+              <w:rPr>
+                <w:b w:val="0"/>
+                <w:sz w:val="15"/>
+              </w:rPr>
+              <w:t>500</w:t>
+            </w:r>
+          </w:p>
+        </w:tc>
+        <w:tc>
+          <w:tcPr>
+            <w:tcW w:type="dxa" w:w="1072"/>
+          </w:tcPr>
+          <w:p>
+            <w:r>
+              <w:rPr>
+                <w:b w:val="0"/>
+                <w:sz w:val="15"/>
+              </w:rPr>
+              <w:t>5.97%</w:t>
+            </w:r>
+          </w:p>
+        </w:tc>
+        <w:tc>
+          <w:tcPr>
+            <w:tcW w:type="dxa" w:w="1072"/>
+          </w:tcPr>
+          <w:p>
+            <w:r>
+              <w:rPr>
+                <w:b w:val="0"/>
+                <w:sz w:val="15"/>
+              </w:rPr>
+              <w:t>0.9527</w:t>
+            </w:r>
+          </w:p>
+        </w:tc>
+        <w:tc>
+          <w:tcPr>
+            <w:tcW w:type="dxa" w:w="1072"/>
+          </w:tcPr>
+          <w:p>
+            <w:r>
+              <w:rPr>
+                <w:b w:val="0"/>
+                <w:sz w:val="15"/>
+              </w:rPr>
+              <w:t>96.4%</w:t>
+            </w:r>
+          </w:p>
+        </w:tc>
+        <w:tc>
+          <w:tcPr>
+            <w:tcW w:type="dxa" w:w="1072"/>
+          </w:tcPr>
+          <w:p>
+            <w:r>
+              <w:rPr>
+                <w:b w:val="0"/>
+                <w:sz w:val="15"/>
+              </w:rPr>
+              <w:t>3.6%</w:t>
+            </w:r>
+          </w:p>
+        </w:tc>
+        <w:tc>
+          <w:tcPr>
+            <w:tcW w:type="dxa" w:w="1072"/>
+          </w:tcPr>
+          <w:p>
+            <w:r>
+              <w:rPr>
+                <w:b w:val="0"/>
+                <w:sz w:val="15"/>
+              </w:rPr>
+              <w:t>419</w:t>
+            </w:r>
+          </w:p>
+        </w:tc>
+        <w:tc>
+          <w:tcPr>
+            <w:tcW w:type="dxa" w:w="1072"/>
+          </w:tcPr>
+          <w:p>
+            <w:r>
+              <w:rPr>
+                <w:b w:val="0"/>
+                <w:sz w:val="15"/>
+              </w:rPr>
+              <w:t>489</w:t>
+            </w:r>
+          </w:p>
+        </w:tc>
+        <w:tc>
+          <w:tcPr>
+            <w:tcW w:type="dxa" w:w="1072"/>
+          </w:tcPr>
+          <w:p>
+            <w:r>
+              <w:rPr>
+                <w:b w:val="0"/>
+                <w:sz w:val="15"/>
+              </w:rPr>
+              <w:t>yes</w:t>
+            </w:r>
+          </w:p>
+        </w:tc>
+      </w:tr>
+      <w:tr>
+        <w:tc>
+          <w:tcPr>
+            <w:tcW w:type="dxa" w:w="1072"/>
+          </w:tcPr>
+          <w:p>
+            <w:r>
+              <w:rPr>
+                <w:b w:val="0"/>
+                <w:sz w:val="15"/>
+              </w:rPr>
+              <w:t>800</w:t>
+            </w:r>
+          </w:p>
+        </w:tc>
+        <w:tc>
+          <w:tcPr>
+            <w:tcW w:type="dxa" w:w="1072"/>
+          </w:tcPr>
+          <w:p>
+            <w:r>
+              <w:rPr>
+                <w:b w:val="0"/>
+                <w:sz w:val="15"/>
+              </w:rPr>
+              <w:t>800</w:t>
+            </w:r>
+          </w:p>
+        </w:tc>
+        <w:tc>
+          <w:tcPr>
+            <w:tcW w:type="dxa" w:w="1072"/>
+          </w:tcPr>
+          <w:p>
+            <w:r>
+              <w:rPr>
+                <w:b w:val="0"/>
+                <w:sz w:val="15"/>
+              </w:rPr>
+              <w:t>9.56%</w:t>
+            </w:r>
+          </w:p>
+        </w:tc>
+        <w:tc>
+          <w:tcPr>
+            <w:tcW w:type="dxa" w:w="1072"/>
+          </w:tcPr>
+          <w:p>
+            <w:r>
+              <w:rPr>
+                <w:b w:val="0"/>
+                <w:sz w:val="15"/>
+              </w:rPr>
+              <w:t>0.9603</w:t>
+            </w:r>
+          </w:p>
+        </w:tc>
+        <w:tc>
+          <w:tcPr>
+            <w:tcW w:type="dxa" w:w="1072"/>
+          </w:tcPr>
+          <w:p>
+            <w:r>
+              <w:rPr>
+                <w:b w:val="0"/>
+                <w:sz w:val="15"/>
+              </w:rPr>
+              <w:t>95.7%</w:t>
+            </w:r>
+          </w:p>
+        </w:tc>
+        <w:tc>
+          <w:tcPr>
+            <w:tcW w:type="dxa" w:w="1072"/>
+          </w:tcPr>
+          <w:p>
+            <w:r>
+              <w:rPr>
+                <w:b w:val="0"/>
+                <w:sz w:val="15"/>
+              </w:rPr>
+              <w:t>4.3%</w:t>
+            </w:r>
+          </w:p>
+        </w:tc>
+        <w:tc>
+          <w:tcPr>
+            <w:tcW w:type="dxa" w:w="1072"/>
+          </w:tcPr>
+          <w:p>
+            <w:r>
+              <w:rPr>
+                <w:b w:val="0"/>
+                <w:sz w:val="15"/>
+              </w:rPr>
+              <w:t>523</w:t>
+            </w:r>
+          </w:p>
+        </w:tc>
+        <w:tc>
+          <w:tcPr>
+            <w:tcW w:type="dxa" w:w="1072"/>
+          </w:tcPr>
+          <w:p>
+            <w:r>
+              <w:rPr>
+                <w:b w:val="0"/>
+                <w:sz w:val="15"/>
+              </w:rPr>
+              <w:t>593</w:t>
+            </w:r>
+          </w:p>
+        </w:tc>
+        <w:tc>
+          <w:tcPr>
+            <w:tcW w:type="dxa" w:w="1072"/>
+          </w:tcPr>
+          <w:p>
+            <w:r>
+              <w:rPr>
+                <w:b w:val="0"/>
+                <w:sz w:val="15"/>
+              </w:rPr>
+              <w:t>NO</w:t>
+            </w:r>
+          </w:p>
+        </w:tc>
+      </w:tr>
+      <w:tr>
+        <w:tc>
+          <w:tcPr>
+            <w:tcW w:type="dxa" w:w="1072"/>
+          </w:tcPr>
+          <w:p>
+            <w:r>
+              <w:rPr>
+                <w:b w:val="0"/>
+                <w:sz w:val="15"/>
+              </w:rPr>
+              <w:t>1200</w:t>
+            </w:r>
+          </w:p>
+        </w:tc>
+        <w:tc>
+          <w:tcPr>
+            <w:tcW w:type="dxa" w:w="1072"/>
+          </w:tcPr>
+          <w:p>
+            <w:r>
+              <w:rPr>
+                <w:b w:val="0"/>
+                <w:sz w:val="15"/>
+              </w:rPr>
+              <w:t>1200</w:t>
+            </w:r>
+          </w:p>
+        </w:tc>
+        <w:tc>
+          <w:tcPr>
+            <w:tcW w:type="dxa" w:w="1072"/>
+          </w:tcPr>
+          <w:p>
+            <w:r>
+              <w:rPr>
+                <w:b w:val="0"/>
+                <w:sz w:val="15"/>
+              </w:rPr>
+              <w:t>14.33%</w:t>
+            </w:r>
+          </w:p>
+        </w:tc>
+        <w:tc>
+          <w:tcPr>
+            <w:tcW w:type="dxa" w:w="1072"/>
+          </w:tcPr>
+          <w:p>
+            <w:r>
+              <w:rPr>
+                <w:b w:val="0"/>
+                <w:sz w:val="15"/>
+              </w:rPr>
+              <w:t>0.9710</w:t>
+            </w:r>
+          </w:p>
+        </w:tc>
+        <w:tc>
+          <w:tcPr>
+            <w:tcW w:type="dxa" w:w="1072"/>
+          </w:tcPr>
+          <w:p>
+            <w:r>
+              <w:rPr>
+                <w:b w:val="0"/>
+                <w:sz w:val="15"/>
+              </w:rPr>
+              <w:t>94.6%</w:t>
+            </w:r>
+          </w:p>
+        </w:tc>
+        <w:tc>
+          <w:tcPr>
+            <w:tcW w:type="dxa" w:w="1072"/>
+          </w:tcPr>
+          <w:p>
+            <w:r>
+              <w:rPr>
+                <w:b w:val="0"/>
+                <w:sz w:val="15"/>
+              </w:rPr>
+              <w:t>5.4%</w:t>
+            </w:r>
+          </w:p>
+        </w:tc>
+        <w:tc>
+          <w:tcPr>
+            <w:tcW w:type="dxa" w:w="1072"/>
+          </w:tcPr>
+          <w:p>
+            <w:r>
+              <w:rPr>
+                <w:b w:val="0"/>
+                <w:sz w:val="15"/>
+              </w:rPr>
+              <w:t>662</w:t>
+            </w:r>
+          </w:p>
+        </w:tc>
+        <w:tc>
+          <w:tcPr>
+            <w:tcW w:type="dxa" w:w="1072"/>
+          </w:tcPr>
+          <w:p>
+            <w:r>
+              <w:rPr>
+                <w:b w:val="0"/>
+                <w:sz w:val="15"/>
+              </w:rPr>
+              <w:t>750</w:t>
+            </w:r>
+          </w:p>
+        </w:tc>
+        <w:tc>
+          <w:tcPr>
+            <w:tcW w:type="dxa" w:w="1072"/>
+          </w:tcPr>
+          <w:p>
+            <w:r>
+              <w:rPr>
+                <w:b w:val="0"/>
+                <w:sz w:val="15"/>
+              </w:rPr>
+              <w:t>NO</w:t>
+            </w:r>
+          </w:p>
+        </w:tc>
+      </w:tr>
+      <w:tr>
+        <w:tc>
+          <w:tcPr>
+            <w:tcW w:type="dxa" w:w="1072"/>
+          </w:tcPr>
+          <w:p>
+            <w:r>
+              <w:rPr>
+                <w:b w:val="0"/>
+                <w:sz w:val="15"/>
+              </w:rPr>
+              <w:t>2000</w:t>
+            </w:r>
+          </w:p>
+        </w:tc>
+        <w:tc>
+          <w:tcPr>
+            <w:tcW w:type="dxa" w:w="1072"/>
+          </w:tcPr>
+          <w:p>
+            <w:r>
+              <w:rPr>
+                <w:b w:val="0"/>
+                <w:sz w:val="15"/>
+              </w:rPr>
+              <w:t>2000</w:t>
+            </w:r>
+          </w:p>
+        </w:tc>
+        <w:tc>
+          <w:tcPr>
+            <w:tcW w:type="dxa" w:w="1072"/>
+          </w:tcPr>
+          <w:p>
+            <w:r>
+              <w:rPr>
+                <w:b w:val="0"/>
+                <w:sz w:val="15"/>
+              </w:rPr>
+              <w:t>23.89%</w:t>
+            </w:r>
+          </w:p>
+        </w:tc>
+        <w:tc>
+          <w:tcPr>
+            <w:tcW w:type="dxa" w:w="1072"/>
+          </w:tcPr>
+          <w:p>
+            <w:r>
+              <w:rPr>
+                <w:b w:val="0"/>
+                <w:sz w:val="15"/>
+              </w:rPr>
+              <w:t>0.9840</w:t>
+            </w:r>
+          </w:p>
+        </w:tc>
+        <w:tc>
+          <w:tcPr>
+            <w:tcW w:type="dxa" w:w="1072"/>
+          </w:tcPr>
+          <w:p>
+            <w:r>
+              <w:rPr>
+                <w:b w:val="0"/>
+                <w:sz w:val="15"/>
+              </w:rPr>
+              <w:t>93.4%</w:t>
+            </w:r>
+          </w:p>
+        </w:tc>
+        <w:tc>
+          <w:tcPr>
+            <w:tcW w:type="dxa" w:w="1072"/>
+          </w:tcPr>
+          <w:p>
+            <w:r>
+              <w:rPr>
+                <w:b w:val="0"/>
+                <w:sz w:val="15"/>
+              </w:rPr>
+              <w:t>6.6%</w:t>
+            </w:r>
+          </w:p>
+        </w:tc>
+        <w:tc>
+          <w:tcPr>
+            <w:tcW w:type="dxa" w:w="1072"/>
+          </w:tcPr>
+          <w:p>
+            <w:r>
+              <w:rPr>
+                <w:b w:val="0"/>
+                <w:sz w:val="15"/>
+              </w:rPr>
+              <w:t>980</w:t>
+            </w:r>
+          </w:p>
+        </w:tc>
+        <w:tc>
+          <w:tcPr>
+            <w:tcW w:type="dxa" w:w="1072"/>
+          </w:tcPr>
+          <w:p>
+            <w:r>
+              <w:rPr>
+                <w:b w:val="0"/>
+                <w:sz w:val="15"/>
+              </w:rPr>
+              <w:t>1040</w:t>
+            </w:r>
+          </w:p>
+        </w:tc>
+        <w:tc>
+          <w:tcPr>
+            <w:tcW w:type="dxa" w:w="1072"/>
+          </w:tcPr>
+          <w:p>
+            <w:r>
+              <w:rPr>
+                <w:b w:val="0"/>
+                <w:sz w:val="15"/>
+              </w:rPr>
+              <w:t>NO</w:t>
+            </w:r>
+          </w:p>
+        </w:tc>
+      </w:tr>
+    </w:tbl>
+    <w:p>
+      <w:pPr>
+        <w:spacing w:after="120"/>
+      </w:pPr>
+      <w:r>
+        <w:rPr>
+          <w:b w:val="0"/>
+          <w:i/>
+          <w:sz w:val="17"/>
+        </w:rPr>
+        <w:t>Three honest findings. (1) More coverage helps, but with diminishing returns and a steep runtime cost: going from K50 (0.6%) to K2000 (23.9%) raises mean PR 0.937 -&gt; 0.984 but pushes p95 decision time 308 ms -&gt; 1040 ms. The bottleneck ranking captures most of the achievable relief in the first few hundred ODs, because the long tail of 8372 ODs contributes little to the bottleneck. (2) There is a hard runtime wall: only K&lt;=500 stays within the 500 ms p95 budget on VtlWavenet (K500: p95 489 ms); K800 and above exceed it (593-1040 ms). So per-cycle near-full-coverage TE on an 8372-OD topology under 500 ms is not feasible with this selected-LP approach - this is an inherent scalability limit of the method on very large topologies. (3) The learned policy is slightly conservative here: K500 stays under 500 ms (p95 489 ms) yet gives a higher PR (0.9527 vs 0.9373 at K50), so a higher K-floor on the largest topology would be a strictly better runtime-safe operating point. This is a concrete, low-risk improvement, not a redesign.</w:t>
       </w:r>
     </w:p>
     <w:p>

</xml_diff>

<commit_message>
Add Dataset & Train/Test Split table to report Section 2 (test-half N clarified; totals, train partition, zero-shot, TRAIN_CAP=160)
</commit_message>
<xml_diff>
--- a/results/gnn_lpd_dqn_selective_db_lp/condition_compliant_k10_k50/FINAL_REPORT/Topology_Agnostic_Bottleneck_Ranking_DDQN_Phase1_5_Final_Report.docx
+++ b/results/gnn_lpd_dqn_selective_db_lp/condition_compliant_k10_k50/FINAL_REPORT/Topology_Agnostic_Bottleneck_Ranking_DDQN_Phase1_5_Final_Report.docx
@@ -81,6 +81,834 @@
           <w:sz w:val="21"/>
         </w:rPr>
         <w:t>Eight topologies are evaluated: Abilene, GEANT, CERNET, Sprintlink, Tiscali, Ebone, Germany50, and VtlWavenet. The controller is trained on seen topologies (Abilene, GEANT, CERNET, Sprintlink, Tiscali, Ebone); Germany50 and VtlWavenet are evaluated zero-shot (never seen in training). Each cycle applies a traffic matrix, the controller selects an action by argmax-Q, the selected-flow LP optimizes the selected top-K OD pairs (nonselected remain ECMP), and PR, DB, MLU, and per-cycle decision time are recorded. Evaluation uses carry-forward routing: KEEP reuses the previously accepted routing.</w:t>
+      </w:r>
+    </w:p>
+    <w:p>
+      <w:pPr>
+        <w:spacing w:after="120"/>
+      </w:pPr>
+      <w:r>
+        <w:rPr>
+          <w:b w:val="0"/>
+          <w:i w:val="0"/>
+          <w:sz w:val="19"/>
+        </w:rPr>
+        <w:t>Dataset and train/test split. Seen topologies use a disjoint train/test split: the controller is trained on the train partition only and the report evaluates exclusively on the held-out test partition (the N column below and in all result tables is the TEST count, never the training cycles). Germany50 and VtlWavenet have no train partition - they are evaluated entirely zero-shot. Training additionally sampled at most 160 cycles per seen topology per episode (TRAIN_CAP=160) from the train partition, over 22 episodes x 6 seen topologies.</w:t>
+      </w:r>
+    </w:p>
+    <w:tbl>
+      <w:tblPr>
+        <w:tblStyle w:val="TableGrid"/>
+        <w:tblW w:type="auto" w:w="0"/>
+        <w:jc w:val="center"/>
+        <w:tblLook w:firstColumn="1" w:firstRow="1" w:lastColumn="0" w:lastRow="0" w:noHBand="0" w:noVBand="1" w:val="04A0"/>
+      </w:tblPr>
+      <w:tblGrid>
+        <w:gridCol w:w="1608"/>
+        <w:gridCol w:w="1608"/>
+        <w:gridCol w:w="1608"/>
+        <w:gridCol w:w="1608"/>
+        <w:gridCol w:w="1608"/>
+        <w:gridCol w:w="1608"/>
+      </w:tblGrid>
+      <w:tr>
+        <w:tc>
+          <w:tcPr>
+            <w:tcW w:type="dxa" w:w="1608"/>
+            <w:shd w:val="clear" w:fill="1F4D78"/>
+          </w:tcPr>
+          <w:p>
+            <w:r>
+              <w:rPr>
+                <w:b/>
+                <w:color w:val="FFFFFF"/>
+                <w:sz w:val="15"/>
+              </w:rPr>
+              <w:t>Topology</w:t>
+            </w:r>
+          </w:p>
+        </w:tc>
+        <w:tc>
+          <w:tcPr>
+            <w:tcW w:type="dxa" w:w="1608"/>
+            <w:shd w:val="clear" w:fill="1F4D78"/>
+          </w:tcPr>
+          <w:p>
+            <w:r>
+              <w:rPr>
+                <w:b/>
+                <w:color w:val="FFFFFF"/>
+                <w:sz w:val="15"/>
+              </w:rPr>
+              <w:t>Type</w:t>
+            </w:r>
+          </w:p>
+        </w:tc>
+        <w:tc>
+          <w:tcPr>
+            <w:tcW w:type="dxa" w:w="1608"/>
+            <w:shd w:val="clear" w:fill="1F4D78"/>
+          </w:tcPr>
+          <w:p>
+            <w:r>
+              <w:rPr>
+                <w:b/>
+                <w:color w:val="FFFFFF"/>
+                <w:sz w:val="15"/>
+              </w:rPr>
+              <w:t>Total TMs in dataset</w:t>
+            </w:r>
+          </w:p>
+        </w:tc>
+        <w:tc>
+          <w:tcPr>
+            <w:tcW w:type="dxa" w:w="1608"/>
+            <w:shd w:val="clear" w:fill="1F4D78"/>
+          </w:tcPr>
+          <w:p>
+            <w:r>
+              <w:rPr>
+                <w:b/>
+                <w:color w:val="FFFFFF"/>
+                <w:sz w:val="15"/>
+              </w:rPr>
+              <w:t>Train partition</w:t>
+            </w:r>
+          </w:p>
+        </w:tc>
+        <w:tc>
+          <w:tcPr>
+            <w:tcW w:type="dxa" w:w="1608"/>
+            <w:shd w:val="clear" w:fill="1F4D78"/>
+          </w:tcPr>
+          <w:p>
+            <w:r>
+              <w:rPr>
+                <w:b/>
+                <w:color w:val="FFFFFF"/>
+                <w:sz w:val="15"/>
+              </w:rPr>
+              <w:t>Test = report N</w:t>
+            </w:r>
+          </w:p>
+        </w:tc>
+        <w:tc>
+          <w:tcPr>
+            <w:tcW w:type="dxa" w:w="1608"/>
+            <w:shd w:val="clear" w:fill="1F4D78"/>
+          </w:tcPr>
+          <w:p>
+            <w:r>
+              <w:rPr>
+                <w:b/>
+                <w:color w:val="FFFFFF"/>
+                <w:sz w:val="15"/>
+              </w:rPr>
+              <w:t>Notes</w:t>
+            </w:r>
+          </w:p>
+        </w:tc>
+      </w:tr>
+      <w:tr>
+        <w:tc>
+          <w:tcPr>
+            <w:tcW w:type="dxa" w:w="1608"/>
+          </w:tcPr>
+          <w:p>
+            <w:r>
+              <w:rPr>
+                <w:b w:val="0"/>
+                <w:sz w:val="15"/>
+              </w:rPr>
+              <w:t>Abilene</w:t>
+            </w:r>
+          </w:p>
+        </w:tc>
+        <w:tc>
+          <w:tcPr>
+            <w:tcW w:type="dxa" w:w="1608"/>
+          </w:tcPr>
+          <w:p>
+            <w:r>
+              <w:rPr>
+                <w:b w:val="0"/>
+                <w:sz w:val="15"/>
+              </w:rPr>
+              <w:t>seen</w:t>
+            </w:r>
+          </w:p>
+        </w:tc>
+        <w:tc>
+          <w:tcPr>
+            <w:tcW w:type="dxa" w:w="1608"/>
+          </w:tcPr>
+          <w:p>
+            <w:r>
+              <w:rPr>
+                <w:b w:val="0"/>
+                <w:sz w:val="15"/>
+              </w:rPr>
+              <w:t>4032</w:t>
+            </w:r>
+          </w:p>
+        </w:tc>
+        <w:tc>
+          <w:tcPr>
+            <w:tcW w:type="dxa" w:w="1608"/>
+          </w:tcPr>
+          <w:p>
+            <w:r>
+              <w:rPr>
+                <w:b w:val="0"/>
+                <w:sz w:val="15"/>
+              </w:rPr>
+              <w:t>2016 (idx 0-2015)</w:t>
+            </w:r>
+          </w:p>
+        </w:tc>
+        <w:tc>
+          <w:tcPr>
+            <w:tcW w:type="dxa" w:w="1608"/>
+          </w:tcPr>
+          <w:p>
+            <w:r>
+              <w:rPr>
+                <w:b w:val="0"/>
+                <w:sz w:val="15"/>
+              </w:rPr>
+              <w:t>2016 (idx 2016-4031)</w:t>
+            </w:r>
+          </w:p>
+        </w:tc>
+        <w:tc>
+          <w:tcPr>
+            <w:tcW w:type="dxa" w:w="1608"/>
+          </w:tcPr>
+          <w:p>
+            <w:r>
+              <w:rPr>
+                <w:b w:val="0"/>
+                <w:sz w:val="15"/>
+              </w:rPr>
+              <w:t>50/50 split</w:t>
+            </w:r>
+          </w:p>
+        </w:tc>
+      </w:tr>
+      <w:tr>
+        <w:tc>
+          <w:tcPr>
+            <w:tcW w:type="dxa" w:w="1608"/>
+          </w:tcPr>
+          <w:p>
+            <w:r>
+              <w:rPr>
+                <w:b w:val="0"/>
+                <w:sz w:val="15"/>
+              </w:rPr>
+              <w:t>GEANT</w:t>
+            </w:r>
+          </w:p>
+        </w:tc>
+        <w:tc>
+          <w:tcPr>
+            <w:tcW w:type="dxa" w:w="1608"/>
+          </w:tcPr>
+          <w:p>
+            <w:r>
+              <w:rPr>
+                <w:b w:val="0"/>
+                <w:sz w:val="15"/>
+              </w:rPr>
+              <w:t>seen</w:t>
+            </w:r>
+          </w:p>
+        </w:tc>
+        <w:tc>
+          <w:tcPr>
+            <w:tcW w:type="dxa" w:w="1608"/>
+          </w:tcPr>
+          <w:p>
+            <w:r>
+              <w:rPr>
+                <w:b w:val="0"/>
+                <w:sz w:val="15"/>
+              </w:rPr>
+              <w:t>1344</w:t>
+            </w:r>
+          </w:p>
+        </w:tc>
+        <w:tc>
+          <w:tcPr>
+            <w:tcW w:type="dxa" w:w="1608"/>
+          </w:tcPr>
+          <w:p>
+            <w:r>
+              <w:rPr>
+                <w:b w:val="0"/>
+                <w:sz w:val="15"/>
+              </w:rPr>
+              <w:t>672 (idx 0-671)</w:t>
+            </w:r>
+          </w:p>
+        </w:tc>
+        <w:tc>
+          <w:tcPr>
+            <w:tcW w:type="dxa" w:w="1608"/>
+          </w:tcPr>
+          <w:p>
+            <w:r>
+              <w:rPr>
+                <w:b w:val="0"/>
+                <w:sz w:val="15"/>
+              </w:rPr>
+              <w:t>672 (idx 672-1343)</w:t>
+            </w:r>
+          </w:p>
+        </w:tc>
+        <w:tc>
+          <w:tcPr>
+            <w:tcW w:type="dxa" w:w="1608"/>
+          </w:tcPr>
+          <w:p>
+            <w:r>
+              <w:rPr>
+                <w:b w:val="0"/>
+                <w:sz w:val="15"/>
+              </w:rPr>
+              <w:t>50/50 split</w:t>
+            </w:r>
+          </w:p>
+        </w:tc>
+      </w:tr>
+      <w:tr>
+        <w:tc>
+          <w:tcPr>
+            <w:tcW w:type="dxa" w:w="1608"/>
+          </w:tcPr>
+          <w:p>
+            <w:r>
+              <w:rPr>
+                <w:b w:val="0"/>
+                <w:sz w:val="15"/>
+              </w:rPr>
+              <w:t>CERNET</w:t>
+            </w:r>
+          </w:p>
+        </w:tc>
+        <w:tc>
+          <w:tcPr>
+            <w:tcW w:type="dxa" w:w="1608"/>
+          </w:tcPr>
+          <w:p>
+            <w:r>
+              <w:rPr>
+                <w:b w:val="0"/>
+                <w:sz w:val="15"/>
+              </w:rPr>
+              <w:t>seen</w:t>
+            </w:r>
+          </w:p>
+        </w:tc>
+        <w:tc>
+          <w:tcPr>
+            <w:tcW w:type="dxa" w:w="1608"/>
+          </w:tcPr>
+          <w:p>
+            <w:r>
+              <w:rPr>
+                <w:b w:val="0"/>
+                <w:sz w:val="15"/>
+              </w:rPr>
+              <w:t>500</w:t>
+            </w:r>
+          </w:p>
+        </w:tc>
+        <w:tc>
+          <w:tcPr>
+            <w:tcW w:type="dxa" w:w="1608"/>
+          </w:tcPr>
+          <w:p>
+            <w:r>
+              <w:rPr>
+                <w:b w:val="0"/>
+                <w:sz w:val="15"/>
+              </w:rPr>
+              <w:t>200 (idx 0-199)</w:t>
+            </w:r>
+          </w:p>
+        </w:tc>
+        <w:tc>
+          <w:tcPr>
+            <w:tcW w:type="dxa" w:w="1608"/>
+          </w:tcPr>
+          <w:p>
+            <w:r>
+              <w:rPr>
+                <w:b w:val="0"/>
+                <w:sz w:val="15"/>
+              </w:rPr>
+              <w:t>200 (idx 200-399)</w:t>
+            </w:r>
+          </w:p>
+        </w:tc>
+        <w:tc>
+          <w:tcPr>
+            <w:tcW w:type="dxa" w:w="1608"/>
+          </w:tcPr>
+          <w:p>
+            <w:r>
+              <w:rPr>
+                <w:b w:val="0"/>
+                <w:sz w:val="15"/>
+              </w:rPr>
+              <w:t>100 TMs unused</w:t>
+            </w:r>
+          </w:p>
+        </w:tc>
+      </w:tr>
+      <w:tr>
+        <w:tc>
+          <w:tcPr>
+            <w:tcW w:type="dxa" w:w="1608"/>
+          </w:tcPr>
+          <w:p>
+            <w:r>
+              <w:rPr>
+                <w:b w:val="0"/>
+                <w:sz w:val="15"/>
+              </w:rPr>
+              <w:t>Sprintlink</w:t>
+            </w:r>
+          </w:p>
+        </w:tc>
+        <w:tc>
+          <w:tcPr>
+            <w:tcW w:type="dxa" w:w="1608"/>
+          </w:tcPr>
+          <w:p>
+            <w:r>
+              <w:rPr>
+                <w:b w:val="0"/>
+                <w:sz w:val="15"/>
+              </w:rPr>
+              <w:t>seen</w:t>
+            </w:r>
+          </w:p>
+        </w:tc>
+        <w:tc>
+          <w:tcPr>
+            <w:tcW w:type="dxa" w:w="1608"/>
+          </w:tcPr>
+          <w:p>
+            <w:r>
+              <w:rPr>
+                <w:b w:val="0"/>
+                <w:sz w:val="15"/>
+              </w:rPr>
+              <w:t>500</w:t>
+            </w:r>
+          </w:p>
+        </w:tc>
+        <w:tc>
+          <w:tcPr>
+            <w:tcW w:type="dxa" w:w="1608"/>
+          </w:tcPr>
+          <w:p>
+            <w:r>
+              <w:rPr>
+                <w:b w:val="0"/>
+                <w:sz w:val="15"/>
+              </w:rPr>
+              <w:t>200</w:t>
+            </w:r>
+          </w:p>
+        </w:tc>
+        <w:tc>
+          <w:tcPr>
+            <w:tcW w:type="dxa" w:w="1608"/>
+          </w:tcPr>
+          <w:p>
+            <w:r>
+              <w:rPr>
+                <w:b w:val="0"/>
+                <w:sz w:val="15"/>
+              </w:rPr>
+              <w:t>200</w:t>
+            </w:r>
+          </w:p>
+        </w:tc>
+        <w:tc>
+          <w:tcPr>
+            <w:tcW w:type="dxa" w:w="1608"/>
+          </w:tcPr>
+          <w:p>
+            <w:r>
+              <w:rPr>
+                <w:b w:val="0"/>
+                <w:sz w:val="15"/>
+              </w:rPr>
+              <w:t>100 TMs unused</w:t>
+            </w:r>
+          </w:p>
+        </w:tc>
+      </w:tr>
+      <w:tr>
+        <w:tc>
+          <w:tcPr>
+            <w:tcW w:type="dxa" w:w="1608"/>
+          </w:tcPr>
+          <w:p>
+            <w:r>
+              <w:rPr>
+                <w:b w:val="0"/>
+                <w:sz w:val="15"/>
+              </w:rPr>
+              <w:t>Tiscali</w:t>
+            </w:r>
+          </w:p>
+        </w:tc>
+        <w:tc>
+          <w:tcPr>
+            <w:tcW w:type="dxa" w:w="1608"/>
+          </w:tcPr>
+          <w:p>
+            <w:r>
+              <w:rPr>
+                <w:b w:val="0"/>
+                <w:sz w:val="15"/>
+              </w:rPr>
+              <w:t>seen</w:t>
+            </w:r>
+          </w:p>
+        </w:tc>
+        <w:tc>
+          <w:tcPr>
+            <w:tcW w:type="dxa" w:w="1608"/>
+          </w:tcPr>
+          <w:p>
+            <w:r>
+              <w:rPr>
+                <w:b w:val="0"/>
+                <w:sz w:val="15"/>
+              </w:rPr>
+              <w:t>500</w:t>
+            </w:r>
+          </w:p>
+        </w:tc>
+        <w:tc>
+          <w:tcPr>
+            <w:tcW w:type="dxa" w:w="1608"/>
+          </w:tcPr>
+          <w:p>
+            <w:r>
+              <w:rPr>
+                <w:b w:val="0"/>
+                <w:sz w:val="15"/>
+              </w:rPr>
+              <w:t>200</w:t>
+            </w:r>
+          </w:p>
+        </w:tc>
+        <w:tc>
+          <w:tcPr>
+            <w:tcW w:type="dxa" w:w="1608"/>
+          </w:tcPr>
+          <w:p>
+            <w:r>
+              <w:rPr>
+                <w:b w:val="0"/>
+                <w:sz w:val="15"/>
+              </w:rPr>
+              <w:t>200</w:t>
+            </w:r>
+          </w:p>
+        </w:tc>
+        <w:tc>
+          <w:tcPr>
+            <w:tcW w:type="dxa" w:w="1608"/>
+          </w:tcPr>
+          <w:p>
+            <w:r>
+              <w:rPr>
+                <w:b w:val="0"/>
+                <w:sz w:val="15"/>
+              </w:rPr>
+              <w:t>100 TMs unused</w:t>
+            </w:r>
+          </w:p>
+        </w:tc>
+      </w:tr>
+      <w:tr>
+        <w:tc>
+          <w:tcPr>
+            <w:tcW w:type="dxa" w:w="1608"/>
+          </w:tcPr>
+          <w:p>
+            <w:r>
+              <w:rPr>
+                <w:b w:val="0"/>
+                <w:sz w:val="15"/>
+              </w:rPr>
+              <w:t>Ebone</w:t>
+            </w:r>
+          </w:p>
+        </w:tc>
+        <w:tc>
+          <w:tcPr>
+            <w:tcW w:type="dxa" w:w="1608"/>
+          </w:tcPr>
+          <w:p>
+            <w:r>
+              <w:rPr>
+                <w:b w:val="0"/>
+                <w:sz w:val="15"/>
+              </w:rPr>
+              <w:t>seen</w:t>
+            </w:r>
+          </w:p>
+        </w:tc>
+        <w:tc>
+          <w:tcPr>
+            <w:tcW w:type="dxa" w:w="1608"/>
+          </w:tcPr>
+          <w:p>
+            <w:r>
+              <w:rPr>
+                <w:b w:val="0"/>
+                <w:sz w:val="15"/>
+              </w:rPr>
+              <w:t>500</w:t>
+            </w:r>
+          </w:p>
+        </w:tc>
+        <w:tc>
+          <w:tcPr>
+            <w:tcW w:type="dxa" w:w="1608"/>
+          </w:tcPr>
+          <w:p>
+            <w:r>
+              <w:rPr>
+                <w:b w:val="0"/>
+                <w:sz w:val="15"/>
+              </w:rPr>
+              <w:t>200</w:t>
+            </w:r>
+          </w:p>
+        </w:tc>
+        <w:tc>
+          <w:tcPr>
+            <w:tcW w:type="dxa" w:w="1608"/>
+          </w:tcPr>
+          <w:p>
+            <w:r>
+              <w:rPr>
+                <w:b w:val="0"/>
+                <w:sz w:val="15"/>
+              </w:rPr>
+              <w:t>200</w:t>
+            </w:r>
+          </w:p>
+        </w:tc>
+        <w:tc>
+          <w:tcPr>
+            <w:tcW w:type="dxa" w:w="1608"/>
+          </w:tcPr>
+          <w:p>
+            <w:r>
+              <w:rPr>
+                <w:b w:val="0"/>
+                <w:sz w:val="15"/>
+              </w:rPr>
+              <w:t>100 TMs unused</w:t>
+            </w:r>
+          </w:p>
+        </w:tc>
+      </w:tr>
+      <w:tr>
+        <w:tc>
+          <w:tcPr>
+            <w:tcW w:type="dxa" w:w="1608"/>
+          </w:tcPr>
+          <w:p>
+            <w:r>
+              <w:rPr>
+                <w:b w:val="0"/>
+                <w:sz w:val="15"/>
+              </w:rPr>
+              <w:t>Germany50</w:t>
+            </w:r>
+          </w:p>
+        </w:tc>
+        <w:tc>
+          <w:tcPr>
+            <w:tcW w:type="dxa" w:w="1608"/>
+          </w:tcPr>
+          <w:p>
+            <w:r>
+              <w:rPr>
+                <w:b w:val="0"/>
+                <w:sz w:val="15"/>
+              </w:rPr>
+              <w:t>zero-shot</w:t>
+            </w:r>
+          </w:p>
+        </w:tc>
+        <w:tc>
+          <w:tcPr>
+            <w:tcW w:type="dxa" w:w="1608"/>
+          </w:tcPr>
+          <w:p>
+            <w:r>
+              <w:rPr>
+                <w:b w:val="0"/>
+                <w:sz w:val="15"/>
+              </w:rPr>
+              <w:t>288</w:t>
+            </w:r>
+          </w:p>
+        </w:tc>
+        <w:tc>
+          <w:tcPr>
+            <w:tcW w:type="dxa" w:w="1608"/>
+          </w:tcPr>
+          <w:p>
+            <w:r>
+              <w:rPr>
+                <w:b w:val="0"/>
+                <w:sz w:val="15"/>
+              </w:rPr>
+              <w:t>none</w:t>
+            </w:r>
+          </w:p>
+        </w:tc>
+        <w:tc>
+          <w:tcPr>
+            <w:tcW w:type="dxa" w:w="1608"/>
+          </w:tcPr>
+          <w:p>
+            <w:r>
+              <w:rPr>
+                <w:b w:val="0"/>
+                <w:sz w:val="15"/>
+              </w:rPr>
+              <w:t>288 (all)</w:t>
+            </w:r>
+          </w:p>
+        </w:tc>
+        <w:tc>
+          <w:tcPr>
+            <w:tcW w:type="dxa" w:w="1608"/>
+          </w:tcPr>
+          <w:p>
+            <w:r>
+              <w:rPr>
+                <w:b w:val="0"/>
+                <w:sz w:val="15"/>
+              </w:rPr>
+              <w:t>never trained on</w:t>
+            </w:r>
+          </w:p>
+        </w:tc>
+      </w:tr>
+      <w:tr>
+        <w:tc>
+          <w:tcPr>
+            <w:tcW w:type="dxa" w:w="1608"/>
+          </w:tcPr>
+          <w:p>
+            <w:r>
+              <w:rPr>
+                <w:b w:val="0"/>
+                <w:sz w:val="15"/>
+              </w:rPr>
+              <w:t>VtlWavenet</w:t>
+            </w:r>
+          </w:p>
+        </w:tc>
+        <w:tc>
+          <w:tcPr>
+            <w:tcW w:type="dxa" w:w="1608"/>
+          </w:tcPr>
+          <w:p>
+            <w:r>
+              <w:rPr>
+                <w:b w:val="0"/>
+                <w:sz w:val="15"/>
+              </w:rPr>
+              <w:t>zero-shot</w:t>
+            </w:r>
+          </w:p>
+        </w:tc>
+        <w:tc>
+          <w:tcPr>
+            <w:tcW w:type="dxa" w:w="1608"/>
+          </w:tcPr>
+          <w:p>
+            <w:r>
+              <w:rPr>
+                <w:b w:val="0"/>
+                <w:sz w:val="15"/>
+              </w:rPr>
+              <w:t>500</w:t>
+            </w:r>
+          </w:p>
+        </w:tc>
+        <w:tc>
+          <w:tcPr>
+            <w:tcW w:type="dxa" w:w="1608"/>
+          </w:tcPr>
+          <w:p>
+            <w:r>
+              <w:rPr>
+                <w:b w:val="0"/>
+                <w:sz w:val="15"/>
+              </w:rPr>
+              <w:t>none</w:t>
+            </w:r>
+          </w:p>
+        </w:tc>
+        <w:tc>
+          <w:tcPr>
+            <w:tcW w:type="dxa" w:w="1608"/>
+          </w:tcPr>
+          <w:p>
+            <w:r>
+              <w:rPr>
+                <w:b w:val="0"/>
+                <w:sz w:val="15"/>
+              </w:rPr>
+              <w:t>40 (frozen) / 200 (robust run)</w:t>
+            </w:r>
+          </w:p>
+        </w:tc>
+        <w:tc>
+          <w:tcPr>
+            <w:tcW w:type="dxa" w:w="1608"/>
+          </w:tcPr>
+          <w:p>
+            <w:r>
+              <w:rPr>
+                <w:b w:val="0"/>
+                <w:sz w:val="15"/>
+              </w:rPr>
+              <w:t>never trained on; 40 of 500 used in frozen eval</w:t>
+            </w:r>
+          </w:p>
+        </w:tc>
+      </w:tr>
+    </w:tbl>
+    <w:p>
+      <w:pPr>
+        <w:spacing w:after="120"/>
+      </w:pPr>
+      <w:r>
+        <w:rPr>
+          <w:b w:val="0"/>
+          <w:i/>
+          <w:sz w:val="17"/>
+        </w:rPr>
+        <w:t>Total cycles evaluated in this report = 2016 + 672 + 200x4 + 288 + 40 = 3816 (test halves of the six seen topologies plus the two zero-shot sets), matching the per-cycle evaluation CSV exactly.</w:t>
       </w:r>
     </w:p>
     <w:p>

</xml_diff>